<commit_message>
Adding some sections to P2 and changing the name of the class for the code
</commit_message>
<xml_diff>
--- a/P2.docx
+++ b/P2.docx
@@ -3,8 +3,244 @@
 <w:document xmlns:wpc="http://schemas.microsoft.com/office/word/2010/wordprocessingCanvas" xmlns:cx="http://schemas.microsoft.com/office/drawing/2014/chartex" xmlns:cx1="http://schemas.microsoft.com/office/drawing/2015/9/8/chartex" xmlns:cx2="http://schemas.microsoft.com/office/drawing/2015/10/21/chartex" xmlns:cx3="http://schemas.microsoft.com/office/drawing/2016/5/9/chartex" xmlns:cx4="http://schemas.microsoft.com/office/drawing/2016/5/10/chartex" xmlns:cx5="http://schemas.microsoft.com/office/drawing/2016/5/11/chartex" xmlns:cx6="http://schemas.microsoft.com/office/drawing/2016/5/12/chartex" xmlns:cx7="http://schemas.microsoft.com/office/drawing/2016/5/13/chartex" xmlns:cx8="http://schemas.microsoft.com/office/drawing/2016/5/14/chartex" xmlns:mc="http://schemas.openxmlformats.org/markup-compatibility/2006" xmlns:aink="http://schemas.microsoft.com/office/drawing/2016/ink" xmlns:am3d="http://schemas.microsoft.com/office/drawing/2017/model3d" xmlns:o="urn:schemas-microsoft-com:office:office" xmlns:oel="http://schemas.microsoft.com/office/2019/extlst" xmlns:r="http://schemas.openxmlformats.org/officeDocument/2006/relationships" xmlns:m="http://schemas.openxmlformats.org/officeDocument/2006/math" xmlns:v="urn:schemas-microsoft-com:vml" xmlns:wp14="http://schemas.microsoft.com/office/word/2010/wordprocessingDrawing" xmlns:wp="http://schemas.openxmlformats.org/drawingml/2006/wordprocessingDrawing" xmlns:w10="urn:schemas-microsoft-com:office:word" xmlns:w="http://schemas.openxmlformats.org/wordprocessingml/2006/main" xmlns:w14="http://schemas.microsoft.com/office/word/2010/wordml" xmlns:w15="http://schemas.microsoft.com/office/word/2012/wordml" xmlns:w16cex="http://schemas.microsoft.com/office/word/2018/wordml/cex" xmlns:w16cid="http://schemas.microsoft.com/office/word/2016/wordml/cid" xmlns:w16="http://schemas.microsoft.com/office/word/2018/wordml" xmlns:w16du="http://schemas.microsoft.com/office/word/2023/wordml/word16du" xmlns:w16sdtdh="http://schemas.microsoft.com/office/word/2020/wordml/sdtdatahash" xmlns:w16sdtfl="http://schemas.microsoft.com/office/word/2024/wordml/sdtformatlock" xmlns:w16se="http://schemas.microsoft.com/office/word/2015/wordml/symex" xmlns:wpg="http://schemas.microsoft.com/office/word/2010/wordprocessingGroup" xmlns:wpi="http://schemas.microsoft.com/office/word/2010/wordprocessingInk" xmlns:wne="http://schemas.microsoft.com/office/word/2006/wordml" xmlns:wps="http://schemas.microsoft.com/office/word/2010/wordprocessingShape" mc:Ignorable="w14 w15 w16se w16cid w16 w16cex w16sdtdh w16sdtfl w16du wp14">
   <w:body>
     <w:p>
+      <w:pPr>
+        <w:rPr>
+          <w:rFonts w:ascii="Times New Roman" w:hAnsi="Times New Roman" w:cs="Times New Roman"/>
+          <w:b/>
+          <w:bCs/>
+        </w:rPr>
+      </w:pPr>
       <w:r>
-        <w:t>Title</w:t>
+        <w:rPr>
+          <w:rFonts w:ascii="Times New Roman" w:hAnsi="Times New Roman" w:cs="Times New Roman"/>
+          <w:b/>
+          <w:bCs/>
+        </w:rPr>
+        <w:t>Abstract</w:t>
+      </w:r>
+    </w:p>
+    <w:p>
+      <w:pPr>
+        <w:rPr>
+          <w:rFonts w:ascii="Times New Roman" w:hAnsi="Times New Roman" w:cs="Times New Roman"/>
+          <w:b/>
+          <w:bCs/>
+        </w:rPr>
+      </w:pPr>
+      <w:r>
+        <w:rPr>
+          <w:rFonts w:ascii="Times New Roman" w:hAnsi="Times New Roman" w:cs="Times New Roman"/>
+          <w:b/>
+          <w:bCs/>
+        </w:rPr>
+        <w:t>Introduction</w:t>
+      </w:r>
+    </w:p>
+    <w:p>
+      <w:pPr>
+        <w:rPr>
+          <w:rFonts w:ascii="Times New Roman" w:hAnsi="Times New Roman" w:cs="Times New Roman"/>
+          <w:b/>
+          <w:bCs/>
+          <w:i/>
+          <w:iCs/>
+        </w:rPr>
+      </w:pPr>
+      <w:r>
+        <w:rPr>
+          <w:rFonts w:ascii="Times New Roman" w:hAnsi="Times New Roman" w:cs="Times New Roman"/>
+          <w:b/>
+          <w:bCs/>
+          <w:i/>
+          <w:iCs/>
+        </w:rPr>
+        <w:t>He</w:t>
+      </w:r>
+      <w:r>
+        <w:rPr>
+          <w:rFonts w:ascii="Times New Roman" w:hAnsi="Times New Roman" w:cs="Times New Roman"/>
+          <w:b/>
+          <w:bCs/>
+          <w:i/>
+          <w:iCs/>
+        </w:rPr>
+        <w:t>apsort</w:t>
+      </w:r>
+    </w:p>
+    <w:p>
+      <w:pPr>
+        <w:rPr>
+          <w:rFonts w:ascii="Times New Roman" w:hAnsi="Times New Roman" w:cs="Times New Roman"/>
+          <w:b/>
+          <w:bCs/>
+          <w:i/>
+          <w:iCs/>
+        </w:rPr>
+      </w:pPr>
+      <w:r>
+        <w:rPr>
+          <w:rFonts w:ascii="Times New Roman" w:hAnsi="Times New Roman" w:cs="Times New Roman"/>
+          <w:b/>
+          <w:bCs/>
+          <w:i/>
+          <w:iCs/>
+        </w:rPr>
+        <w:t xml:space="preserve">Merge </w:t>
+      </w:r>
+      <w:proofErr w:type="gramStart"/>
+      <w:r>
+        <w:rPr>
+          <w:rFonts w:ascii="Times New Roman" w:hAnsi="Times New Roman" w:cs="Times New Roman"/>
+          <w:b/>
+          <w:bCs/>
+          <w:i/>
+          <w:iCs/>
+        </w:rPr>
+        <w:t>sort</w:t>
+      </w:r>
+      <w:proofErr w:type="gramEnd"/>
+    </w:p>
+    <w:p>
+      <w:pPr>
+        <w:rPr>
+          <w:rFonts w:ascii="Times New Roman" w:hAnsi="Times New Roman" w:cs="Times New Roman"/>
+          <w:b/>
+          <w:bCs/>
+          <w:i/>
+          <w:iCs/>
+        </w:rPr>
+      </w:pPr>
+      <w:r>
+        <w:rPr>
+          <w:rFonts w:ascii="Times New Roman" w:hAnsi="Times New Roman" w:cs="Times New Roman"/>
+          <w:b/>
+          <w:bCs/>
+          <w:i/>
+          <w:iCs/>
+        </w:rPr>
+        <w:t>Quicksort</w:t>
+      </w:r>
+    </w:p>
+    <w:p>
+      <w:pPr>
+        <w:rPr>
+          <w:rFonts w:ascii="Times New Roman" w:hAnsi="Times New Roman" w:cs="Times New Roman"/>
+          <w:b/>
+          <w:bCs/>
+          <w:i/>
+          <w:iCs/>
+        </w:rPr>
+      </w:pPr>
+      <w:r>
+        <w:rPr>
+          <w:rFonts w:ascii="Times New Roman" w:hAnsi="Times New Roman" w:cs="Times New Roman"/>
+          <w:b/>
+          <w:bCs/>
+          <w:i/>
+          <w:iCs/>
+        </w:rPr>
+        <w:t xml:space="preserve">Tree </w:t>
+      </w:r>
+      <w:proofErr w:type="gramStart"/>
+      <w:r>
+        <w:rPr>
+          <w:rFonts w:ascii="Times New Roman" w:hAnsi="Times New Roman" w:cs="Times New Roman"/>
+          <w:b/>
+          <w:bCs/>
+          <w:i/>
+          <w:iCs/>
+        </w:rPr>
+        <w:t>sort</w:t>
+      </w:r>
+      <w:proofErr w:type="gramEnd"/>
+    </w:p>
+    <w:p>
+      <w:pPr>
+        <w:rPr>
+          <w:rFonts w:ascii="Times New Roman" w:hAnsi="Times New Roman" w:cs="Times New Roman"/>
+          <w:b/>
+          <w:bCs/>
+          <w:i/>
+          <w:iCs/>
+        </w:rPr>
+      </w:pPr>
+      <w:r>
+        <w:rPr>
+          <w:rFonts w:ascii="Times New Roman" w:hAnsi="Times New Roman" w:cs="Times New Roman"/>
+          <w:b/>
+          <w:bCs/>
+          <w:i/>
+          <w:iCs/>
+        </w:rPr>
+        <w:t>Your fifth choice</w:t>
+      </w:r>
+    </w:p>
+    <w:p>
+      <w:pPr>
+        <w:rPr>
+          <w:rFonts w:ascii="Times New Roman" w:hAnsi="Times New Roman" w:cs="Times New Roman"/>
+          <w:b/>
+          <w:bCs/>
+        </w:rPr>
+      </w:pPr>
+      <w:r>
+        <w:rPr>
+          <w:rFonts w:ascii="Times New Roman" w:hAnsi="Times New Roman" w:cs="Times New Roman"/>
+          <w:b/>
+          <w:bCs/>
+        </w:rPr>
+        <w:t>Methodology</w:t>
+      </w:r>
+    </w:p>
+    <w:p>
+      <w:pPr>
+        <w:rPr>
+          <w:rFonts w:ascii="Times New Roman" w:hAnsi="Times New Roman" w:cs="Times New Roman"/>
+          <w:b/>
+          <w:bCs/>
+        </w:rPr>
+      </w:pPr>
+      <w:r>
+        <w:rPr>
+          <w:rFonts w:ascii="Times New Roman" w:hAnsi="Times New Roman" w:cs="Times New Roman"/>
+          <w:b/>
+          <w:bCs/>
+        </w:rPr>
+        <w:t>Results</w:t>
+      </w:r>
+    </w:p>
+    <w:p>
+      <w:pPr>
+        <w:rPr>
+          <w:rFonts w:ascii="Times New Roman" w:hAnsi="Times New Roman" w:cs="Times New Roman"/>
+          <w:b/>
+          <w:bCs/>
+        </w:rPr>
+      </w:pPr>
+      <w:r>
+        <w:rPr>
+          <w:rFonts w:ascii="Times New Roman" w:hAnsi="Times New Roman" w:cs="Times New Roman"/>
+          <w:b/>
+          <w:bCs/>
+        </w:rPr>
+        <w:t>Conclusions</w:t>
+      </w:r>
+    </w:p>
+    <w:p>
+      <w:pPr>
+        <w:rPr>
+          <w:rFonts w:ascii="Times New Roman" w:hAnsi="Times New Roman" w:cs="Times New Roman"/>
+          <w:b/>
+          <w:bCs/>
+        </w:rPr>
+      </w:pPr>
+      <w:r>
+        <w:rPr>
+          <w:rFonts w:ascii="Times New Roman" w:hAnsi="Times New Roman" w:cs="Times New Roman"/>
+          <w:b/>
+          <w:bCs/>
+        </w:rPr>
+        <w:t>References</w:t>
       </w:r>
     </w:p>
     <w:sectPr>
@@ -15,6 +251,163 @@
     </w:sectPr>
   </w:body>
 </w:document>
+</file>
+
+<file path=word/numbering.xml><?xml version="1.0" encoding="utf-8"?>
+<w:numbering xmlns:wpc="http://schemas.microsoft.com/office/word/2010/wordprocessingCanvas" xmlns:cx="http://schemas.microsoft.com/office/drawing/2014/chartex" xmlns:cx1="http://schemas.microsoft.com/office/drawing/2015/9/8/chartex" xmlns:cx2="http://schemas.microsoft.com/office/drawing/2015/10/21/chartex" xmlns:cx3="http://schemas.microsoft.com/office/drawing/2016/5/9/chartex" xmlns:cx4="http://schemas.microsoft.com/office/drawing/2016/5/10/chartex" xmlns:cx5="http://schemas.microsoft.com/office/drawing/2016/5/11/chartex" xmlns:cx6="http://schemas.microsoft.com/office/drawing/2016/5/12/chartex" xmlns:cx7="http://schemas.microsoft.com/office/drawing/2016/5/13/chartex" xmlns:cx8="http://schemas.microsoft.com/office/drawing/2016/5/14/chartex" xmlns:mc="http://schemas.openxmlformats.org/markup-compatibility/2006" xmlns:aink="http://schemas.microsoft.com/office/drawing/2016/ink" xmlns:am3d="http://schemas.microsoft.com/office/drawing/2017/model3d" xmlns:o="urn:schemas-microsoft-com:office:office" xmlns:oel="http://schemas.microsoft.com/office/2019/extlst" xmlns:r="http://schemas.openxmlformats.org/officeDocument/2006/relationships" xmlns:m="http://schemas.openxmlformats.org/officeDocument/2006/math" xmlns:v="urn:schemas-microsoft-com:vml" xmlns:wp14="http://schemas.microsoft.com/office/word/2010/wordprocessingDrawing" xmlns:wp="http://schemas.openxmlformats.org/drawingml/2006/wordprocessingDrawing" xmlns:w10="urn:schemas-microsoft-com:office:word" xmlns:w="http://schemas.openxmlformats.org/wordprocessingml/2006/main" xmlns:w14="http://schemas.microsoft.com/office/word/2010/wordml" xmlns:w15="http://schemas.microsoft.com/office/word/2012/wordml" xmlns:w16cex="http://schemas.microsoft.com/office/word/2018/wordml/cex" xmlns:w16cid="http://schemas.microsoft.com/office/word/2016/wordml/cid" xmlns:w16="http://schemas.microsoft.com/office/word/2018/wordml" xmlns:w16du="http://schemas.microsoft.com/office/word/2023/wordml/word16du" xmlns:w16sdtdh="http://schemas.microsoft.com/office/word/2020/wordml/sdtdatahash" xmlns:w16sdtfl="http://schemas.microsoft.com/office/word/2024/wordml/sdtformatlock" xmlns:w16se="http://schemas.microsoft.com/office/word/2015/wordml/symex" xmlns:wpg="http://schemas.microsoft.com/office/word/2010/wordprocessingGroup" xmlns:wpi="http://schemas.microsoft.com/office/word/2010/wordprocessingInk" xmlns:wne="http://schemas.microsoft.com/office/word/2006/wordml" xmlns:wps="http://schemas.microsoft.com/office/word/2010/wordprocessingShape" mc:Ignorable="w14 w15 w16se w16cid w16 w16cex w16sdtdh w16sdtfl w16du wp14">
+  <w:abstractNum w:abstractNumId="0" w15:restartNumberingAfterBreak="0">
+    <w:nsid w:val="521E0422"/>
+    <w:multiLevelType w:val="multilevel"/>
+    <w:tmpl w:val="649C4C58"/>
+    <w:lvl w:ilvl="0">
+      <w:start w:val="1"/>
+      <w:numFmt w:val="bullet"/>
+      <w:lvlText w:val=""/>
+      <w:lvlJc w:val="left"/>
+      <w:pPr>
+        <w:tabs>
+          <w:tab w:val="num" w:pos="720"/>
+        </w:tabs>
+        <w:ind w:left="720" w:hanging="360"/>
+      </w:pPr>
+      <w:rPr>
+        <w:rFonts w:ascii="Symbol" w:hAnsi="Symbol" w:hint="default"/>
+        <w:sz w:val="20"/>
+      </w:rPr>
+    </w:lvl>
+    <w:lvl w:ilvl="1" w:tentative="1">
+      <w:start w:val="1"/>
+      <w:numFmt w:val="bullet"/>
+      <w:lvlText w:val="o"/>
+      <w:lvlJc w:val="left"/>
+      <w:pPr>
+        <w:tabs>
+          <w:tab w:val="num" w:pos="1440"/>
+        </w:tabs>
+        <w:ind w:left="1440" w:hanging="360"/>
+      </w:pPr>
+      <w:rPr>
+        <w:rFonts w:ascii="Courier New" w:hAnsi="Courier New" w:hint="default"/>
+        <w:sz w:val="20"/>
+      </w:rPr>
+    </w:lvl>
+    <w:lvl w:ilvl="2" w:tentative="1">
+      <w:start w:val="1"/>
+      <w:numFmt w:val="bullet"/>
+      <w:lvlText w:val=""/>
+      <w:lvlJc w:val="left"/>
+      <w:pPr>
+        <w:tabs>
+          <w:tab w:val="num" w:pos="2160"/>
+        </w:tabs>
+        <w:ind w:left="2160" w:hanging="360"/>
+      </w:pPr>
+      <w:rPr>
+        <w:rFonts w:ascii="Wingdings" w:hAnsi="Wingdings" w:hint="default"/>
+        <w:sz w:val="20"/>
+      </w:rPr>
+    </w:lvl>
+    <w:lvl w:ilvl="3" w:tentative="1">
+      <w:start w:val="1"/>
+      <w:numFmt w:val="bullet"/>
+      <w:lvlText w:val=""/>
+      <w:lvlJc w:val="left"/>
+      <w:pPr>
+        <w:tabs>
+          <w:tab w:val="num" w:pos="2880"/>
+        </w:tabs>
+        <w:ind w:left="2880" w:hanging="360"/>
+      </w:pPr>
+      <w:rPr>
+        <w:rFonts w:ascii="Wingdings" w:hAnsi="Wingdings" w:hint="default"/>
+        <w:sz w:val="20"/>
+      </w:rPr>
+    </w:lvl>
+    <w:lvl w:ilvl="4" w:tentative="1">
+      <w:start w:val="1"/>
+      <w:numFmt w:val="bullet"/>
+      <w:lvlText w:val=""/>
+      <w:lvlJc w:val="left"/>
+      <w:pPr>
+        <w:tabs>
+          <w:tab w:val="num" w:pos="3600"/>
+        </w:tabs>
+        <w:ind w:left="3600" w:hanging="360"/>
+      </w:pPr>
+      <w:rPr>
+        <w:rFonts w:ascii="Wingdings" w:hAnsi="Wingdings" w:hint="default"/>
+        <w:sz w:val="20"/>
+      </w:rPr>
+    </w:lvl>
+    <w:lvl w:ilvl="5" w:tentative="1">
+      <w:start w:val="1"/>
+      <w:numFmt w:val="bullet"/>
+      <w:lvlText w:val=""/>
+      <w:lvlJc w:val="left"/>
+      <w:pPr>
+        <w:tabs>
+          <w:tab w:val="num" w:pos="4320"/>
+        </w:tabs>
+        <w:ind w:left="4320" w:hanging="360"/>
+      </w:pPr>
+      <w:rPr>
+        <w:rFonts w:ascii="Wingdings" w:hAnsi="Wingdings" w:hint="default"/>
+        <w:sz w:val="20"/>
+      </w:rPr>
+    </w:lvl>
+    <w:lvl w:ilvl="6" w:tentative="1">
+      <w:start w:val="1"/>
+      <w:numFmt w:val="bullet"/>
+      <w:lvlText w:val=""/>
+      <w:lvlJc w:val="left"/>
+      <w:pPr>
+        <w:tabs>
+          <w:tab w:val="num" w:pos="5040"/>
+        </w:tabs>
+        <w:ind w:left="5040" w:hanging="360"/>
+      </w:pPr>
+      <w:rPr>
+        <w:rFonts w:ascii="Wingdings" w:hAnsi="Wingdings" w:hint="default"/>
+        <w:sz w:val="20"/>
+      </w:rPr>
+    </w:lvl>
+    <w:lvl w:ilvl="7" w:tentative="1">
+      <w:start w:val="1"/>
+      <w:numFmt w:val="bullet"/>
+      <w:lvlText w:val=""/>
+      <w:lvlJc w:val="left"/>
+      <w:pPr>
+        <w:tabs>
+          <w:tab w:val="num" w:pos="5760"/>
+        </w:tabs>
+        <w:ind w:left="5760" w:hanging="360"/>
+      </w:pPr>
+      <w:rPr>
+        <w:rFonts w:ascii="Wingdings" w:hAnsi="Wingdings" w:hint="default"/>
+        <w:sz w:val="20"/>
+      </w:rPr>
+    </w:lvl>
+    <w:lvl w:ilvl="8" w:tentative="1">
+      <w:start w:val="1"/>
+      <w:numFmt w:val="bullet"/>
+      <w:lvlText w:val=""/>
+      <w:lvlJc w:val="left"/>
+      <w:pPr>
+        <w:tabs>
+          <w:tab w:val="num" w:pos="6480"/>
+        </w:tabs>
+        <w:ind w:left="6480" w:hanging="360"/>
+      </w:pPr>
+      <w:rPr>
+        <w:rFonts w:ascii="Wingdings" w:hAnsi="Wingdings" w:hint="default"/>
+        <w:sz w:val="20"/>
+      </w:rPr>
+    </w:lvl>
+  </w:abstractNum>
+  <w:num w:numId="1" w16cid:durableId="606230729">
+    <w:abstractNumId w:val="0"/>
+  </w:num>
+</w:numbering>
 </file>
 
 <file path=word/styles.xml><?xml version="1.0" encoding="utf-8"?>

</xml_diff>

<commit_message>
Adding some outline to the paper.
</commit_message>
<xml_diff>
--- a/P2.docx
+++ b/P2.docx
@@ -6,6 +6,239 @@
       <w:pPr>
         <w:rPr>
           <w:rFonts w:ascii="Times New Roman" w:hAnsi="Times New Roman" w:cs="Times New Roman"/>
+        </w:rPr>
+      </w:pPr>
+      <w:r>
+        <w:rPr>
+          <w:rFonts w:ascii="Times New Roman" w:hAnsi="Times New Roman" w:cs="Times New Roman"/>
+        </w:rPr>
+        <w:t>Abstract: Approximately 100–200 words describing what the paper is about.</w:t>
+      </w:r>
+    </w:p>
+    <w:p>
+      <w:pPr>
+        <w:rPr>
+          <w:rFonts w:ascii="Times New Roman" w:hAnsi="Times New Roman" w:cs="Times New Roman"/>
+        </w:rPr>
+      </w:pPr>
+      <w:r>
+        <w:rPr>
+          <w:rFonts w:ascii="Times New Roman" w:hAnsi="Times New Roman" w:cs="Times New Roman"/>
+        </w:rPr>
+        <w:t xml:space="preserve">Introduction: Describe the background and give a textual (not </w:t>
+      </w:r>
+      <w:proofErr w:type="gramStart"/>
+      <w:r>
+        <w:rPr>
+          <w:rFonts w:ascii="Times New Roman" w:hAnsi="Times New Roman" w:cs="Times New Roman"/>
+        </w:rPr>
+        <w:t>bulleted</w:t>
+      </w:r>
+      <w:proofErr w:type="gramEnd"/>
+      <w:r>
+        <w:rPr>
+          <w:rFonts w:ascii="Times New Roman" w:hAnsi="Times New Roman" w:cs="Times New Roman"/>
+        </w:rPr>
+        <w:t>) outline of the paper</w:t>
+      </w:r>
+    </w:p>
+    <w:p>
+      <w:pPr>
+        <w:rPr>
+          <w:rFonts w:ascii="Times New Roman" w:hAnsi="Times New Roman" w:cs="Times New Roman"/>
+        </w:rPr>
+      </w:pPr>
+      <w:r>
+        <w:rPr>
+          <w:rFonts w:ascii="Times New Roman" w:hAnsi="Times New Roman" w:cs="Times New Roman"/>
+        </w:rPr>
+        <w:t>One section per sorting algorithm, briefly describing how they work. For each algorithm, give the following:</w:t>
+      </w:r>
+    </w:p>
+    <w:p>
+      <w:pPr>
+        <w:rPr>
+          <w:rFonts w:ascii="Times New Roman" w:hAnsi="Times New Roman" w:cs="Times New Roman"/>
+        </w:rPr>
+      </w:pPr>
+      <w:proofErr w:type="gramStart"/>
+      <w:r>
+        <w:rPr>
+          <w:rFonts w:ascii="Times New Roman" w:hAnsi="Times New Roman" w:cs="Times New Roman"/>
+        </w:rPr>
+        <w:t>a textual</w:t>
+      </w:r>
+      <w:proofErr w:type="gramEnd"/>
+      <w:r>
+        <w:rPr>
+          <w:rFonts w:ascii="Times New Roman" w:hAnsi="Times New Roman" w:cs="Times New Roman"/>
+        </w:rPr>
+        <w:t xml:space="preserve"> description of how it works</w:t>
+      </w:r>
+    </w:p>
+    <w:p>
+      <w:pPr>
+        <w:rPr>
+          <w:rFonts w:ascii="Times New Roman" w:hAnsi="Times New Roman" w:cs="Times New Roman"/>
+        </w:rPr>
+      </w:pPr>
+      <w:r>
+        <w:rPr>
+          <w:rFonts w:ascii="Times New Roman" w:hAnsi="Times New Roman" w:cs="Times New Roman"/>
+        </w:rPr>
+        <w:t>a visualization showing key components of the algorithm, operating on the initial array [8, 6, 7, 5, 3, 0, 9] — do not copy images from your sources; that is copyright infringement</w:t>
+      </w:r>
+    </w:p>
+    <w:p>
+      <w:pPr>
+        <w:rPr>
+          <w:rFonts w:ascii="Times New Roman" w:hAnsi="Times New Roman" w:cs="Times New Roman"/>
+        </w:rPr>
+      </w:pPr>
+      <w:r>
+        <w:rPr>
+          <w:rFonts w:ascii="Times New Roman" w:hAnsi="Times New Roman" w:cs="Times New Roman"/>
+        </w:rPr>
+        <w:t>Methodology: Devise and describe an experiment that will tell you which algorithm performs the best under some metric. That might be any of “time elapsed”, “memory used”, “comparisons made”, and so on.</w:t>
+      </w:r>
+    </w:p>
+    <w:p>
+      <w:pPr>
+        <w:rPr>
+          <w:rFonts w:ascii="Times New Roman" w:hAnsi="Times New Roman" w:cs="Times New Roman"/>
+        </w:rPr>
+      </w:pPr>
+      <w:r>
+        <w:rPr>
+          <w:rFonts w:ascii="Times New Roman" w:hAnsi="Times New Roman" w:cs="Times New Roman"/>
+        </w:rPr>
+        <w:t>Results: Run your experiment and report what you saw. This is probably the most freeform section, and may include tables, graphs, etc. Present your data in a way that tells a story.</w:t>
+      </w:r>
+    </w:p>
+    <w:p>
+      <w:pPr>
+        <w:rPr>
+          <w:rFonts w:ascii="Times New Roman" w:hAnsi="Times New Roman" w:cs="Times New Roman"/>
+        </w:rPr>
+      </w:pPr>
+      <w:r>
+        <w:rPr>
+          <w:rFonts w:ascii="Times New Roman" w:hAnsi="Times New Roman" w:cs="Times New Roman"/>
+        </w:rPr>
+        <w:t xml:space="preserve">Conclusions: Summarize the paper and provide a </w:t>
+      </w:r>
+      <w:proofErr w:type="gramStart"/>
+      <w:r>
+        <w:rPr>
+          <w:rFonts w:ascii="Times New Roman" w:hAnsi="Times New Roman" w:cs="Times New Roman"/>
+        </w:rPr>
+        <w:t>launching</w:t>
+      </w:r>
+      <w:proofErr w:type="gramEnd"/>
+      <w:r>
+        <w:rPr>
+          <w:rFonts w:ascii="Times New Roman" w:hAnsi="Times New Roman" w:cs="Times New Roman"/>
+        </w:rPr>
+        <w:t xml:space="preserve"> point for further discussion.</w:t>
+      </w:r>
+    </w:p>
+    <w:p>
+      <w:pPr>
+        <w:rPr>
+          <w:rFonts w:ascii="Times New Roman" w:hAnsi="Times New Roman" w:cs="Times New Roman"/>
+        </w:rPr>
+      </w:pPr>
+      <w:r>
+        <w:rPr>
+          <w:rFonts w:ascii="Times New Roman" w:hAnsi="Times New Roman" w:cs="Times New Roman"/>
+        </w:rPr>
+        <w:t>References: List works that you cite in-text here.</w:t>
+      </w:r>
+    </w:p>
+    <w:p>
+      <w:pPr>
+        <w:rPr>
+          <w:rFonts w:ascii="Times New Roman" w:hAnsi="Times New Roman" w:cs="Times New Roman"/>
+        </w:rPr>
+      </w:pPr>
+      <w:r>
+        <w:rPr>
+          <w:rFonts w:ascii="Times New Roman" w:hAnsi="Times New Roman" w:cs="Times New Roman"/>
+        </w:rPr>
+        <w:t>Do not list anything that you do not cite in-text.</w:t>
+      </w:r>
+    </w:p>
+    <w:p>
+      <w:pPr>
+        <w:rPr>
+          <w:rFonts w:ascii="Times New Roman" w:hAnsi="Times New Roman" w:cs="Times New Roman"/>
+        </w:rPr>
+      </w:pPr>
+      <w:r>
+        <w:rPr>
+          <w:rFonts w:ascii="Times New Roman" w:hAnsi="Times New Roman" w:cs="Times New Roman"/>
+        </w:rPr>
+        <w:t xml:space="preserve">Any time that you are using ideas or words from another source, you absolutely </w:t>
+      </w:r>
+      <w:proofErr w:type="gramStart"/>
+      <w:r>
+        <w:rPr>
+          <w:rFonts w:ascii="Times New Roman" w:hAnsi="Times New Roman" w:cs="Times New Roman"/>
+        </w:rPr>
+        <w:t>have to</w:t>
+      </w:r>
+      <w:proofErr w:type="gramEnd"/>
+      <w:r>
+        <w:rPr>
+          <w:rFonts w:ascii="Times New Roman" w:hAnsi="Times New Roman" w:cs="Times New Roman"/>
+        </w:rPr>
+        <w:t xml:space="preserve"> cite that source in-text, like “On average, a binary search tree with n keys generated from a random series of insertions and removals of keys has expected height O(</w:t>
+      </w:r>
+      <w:proofErr w:type="spellStart"/>
+      <w:r>
+        <w:rPr>
+          <w:rFonts w:ascii="Times New Roman" w:hAnsi="Times New Roman" w:cs="Times New Roman"/>
+        </w:rPr>
+        <w:t>logn</w:t>
+      </w:r>
+      <w:proofErr w:type="spellEnd"/>
+      <w:r>
+        <w:rPr>
+          <w:rFonts w:ascii="Times New Roman" w:hAnsi="Times New Roman" w:cs="Times New Roman"/>
+        </w:rPr>
+        <w:t>) (Goodrich et al., 2014, p.470).”</w:t>
+      </w:r>
+    </w:p>
+    <w:p>
+      <w:pPr>
+        <w:rPr>
+          <w:rFonts w:ascii="Times New Roman" w:hAnsi="Times New Roman" w:cs="Times New Roman"/>
+        </w:rPr>
+      </w:pPr>
+      <w:r>
+        <w:rPr>
+          <w:rFonts w:ascii="Times New Roman" w:hAnsi="Times New Roman" w:cs="Times New Roman"/>
+        </w:rPr>
+        <w:t>Appendix: Include the entire source code of your implementation typeset into the document.</w:t>
+      </w:r>
+    </w:p>
+    <w:p>
+      <w:pPr>
+        <w:rPr>
+          <w:rFonts w:ascii="Times New Roman" w:hAnsi="Times New Roman" w:cs="Times New Roman"/>
+        </w:rPr>
+      </w:pPr>
+      <w:r>
+        <w:rPr>
+          <w:rFonts w:ascii="Times New Roman" w:hAnsi="Times New Roman" w:cs="Times New Roman"/>
+        </w:rPr>
+        <w:t>Log: Include a transcript of your git log.</w:t>
+      </w:r>
+    </w:p>
+    <w:p>
+      <w:pPr>
+        <w:rPr>
+          <w:rFonts w:ascii="Times New Roman" w:hAnsi="Times New Roman" w:cs="Times New Roman"/>
           <w:b/>
           <w:bCs/>
         </w:rPr>
@@ -18,6 +251,13 @@
         </w:rPr>
         <w:t>Abstract</w:t>
       </w:r>
+    </w:p>
+    <w:p>
+      <w:pPr>
+        <w:rPr>
+          <w:rFonts w:ascii="Times New Roman" w:hAnsi="Times New Roman" w:cs="Times New Roman"/>
+        </w:rPr>
+      </w:pPr>
     </w:p>
     <w:p>
       <w:pPr>
@@ -54,9 +294,11 @@
           <w:i/>
           <w:iCs/>
         </w:rPr>
-        <w:t>He</w:t>
-      </w:r>
-      <w:r>
+        <w:t>Heapsort</w:t>
+      </w:r>
+    </w:p>
+    <w:p>
+      <w:pPr>
         <w:rPr>
           <w:rFonts w:ascii="Times New Roman" w:hAnsi="Times New Roman" w:cs="Times New Roman"/>
           <w:b/>
@@ -64,11 +306,8 @@
           <w:i/>
           <w:iCs/>
         </w:rPr>
-        <w:t>apsort</w:t>
-      </w:r>
-    </w:p>
-    <w:p>
-      <w:pPr>
+      </w:pPr>
+      <w:r>
         <w:rPr>
           <w:rFonts w:ascii="Times New Roman" w:hAnsi="Times New Roman" w:cs="Times New Roman"/>
           <w:b/>
@@ -76,7 +315,9 @@
           <w:i/>
           <w:iCs/>
         </w:rPr>
-      </w:pPr>
+        <w:t xml:space="preserve">Merge </w:t>
+      </w:r>
+      <w:proofErr w:type="gramStart"/>
       <w:r>
         <w:rPr>
           <w:rFonts w:ascii="Times New Roman" w:hAnsi="Times New Roman" w:cs="Times New Roman"/>
@@ -85,10 +326,12 @@
           <w:i/>
           <w:iCs/>
         </w:rPr>
-        <w:t xml:space="preserve">Merge </w:t>
-      </w:r>
-      <w:proofErr w:type="gramStart"/>
-      <w:r>
+        <w:t>sort</w:t>
+      </w:r>
+      <w:proofErr w:type="gramEnd"/>
+    </w:p>
+    <w:p>
+      <w:pPr>
         <w:rPr>
           <w:rFonts w:ascii="Times New Roman" w:hAnsi="Times New Roman" w:cs="Times New Roman"/>
           <w:b/>
@@ -96,12 +339,8 @@
           <w:i/>
           <w:iCs/>
         </w:rPr>
-        <w:t>sort</w:t>
-      </w:r>
-      <w:proofErr w:type="gramEnd"/>
-    </w:p>
-    <w:p>
-      <w:pPr>
+      </w:pPr>
+      <w:r>
         <w:rPr>
           <w:rFonts w:ascii="Times New Roman" w:hAnsi="Times New Roman" w:cs="Times New Roman"/>
           <w:b/>
@@ -109,8 +348,11 @@
           <w:i/>
           <w:iCs/>
         </w:rPr>
-      </w:pPr>
-      <w:r>
+        <w:t>Quicksort</w:t>
+      </w:r>
+    </w:p>
+    <w:p>
+      <w:pPr>
         <w:rPr>
           <w:rFonts w:ascii="Times New Roman" w:hAnsi="Times New Roman" w:cs="Times New Roman"/>
           <w:b/>
@@ -118,11 +360,8 @@
           <w:i/>
           <w:iCs/>
         </w:rPr>
-        <w:t>Quicksort</w:t>
-      </w:r>
-    </w:p>
-    <w:p>
-      <w:pPr>
+      </w:pPr>
+      <w:r>
         <w:rPr>
           <w:rFonts w:ascii="Times New Roman" w:hAnsi="Times New Roman" w:cs="Times New Roman"/>
           <w:b/>
@@ -130,7 +369,9 @@
           <w:i/>
           <w:iCs/>
         </w:rPr>
-      </w:pPr>
+        <w:t xml:space="preserve">Tree </w:t>
+      </w:r>
+      <w:proofErr w:type="gramStart"/>
       <w:r>
         <w:rPr>
           <w:rFonts w:ascii="Times New Roman" w:hAnsi="Times New Roman" w:cs="Times New Roman"/>
@@ -139,10 +380,12 @@
           <w:i/>
           <w:iCs/>
         </w:rPr>
-        <w:t xml:space="preserve">Tree </w:t>
-      </w:r>
-      <w:proofErr w:type="gramStart"/>
-      <w:r>
+        <w:t>sort</w:t>
+      </w:r>
+      <w:proofErr w:type="gramEnd"/>
+    </w:p>
+    <w:p>
+      <w:pPr>
         <w:rPr>
           <w:rFonts w:ascii="Times New Roman" w:hAnsi="Times New Roman" w:cs="Times New Roman"/>
           <w:b/>
@@ -150,12 +393,8 @@
           <w:i/>
           <w:iCs/>
         </w:rPr>
-        <w:t>sort</w:t>
-      </w:r>
-      <w:proofErr w:type="gramEnd"/>
-    </w:p>
-    <w:p>
-      <w:pPr>
+      </w:pPr>
+      <w:r>
         <w:rPr>
           <w:rFonts w:ascii="Times New Roman" w:hAnsi="Times New Roman" w:cs="Times New Roman"/>
           <w:b/>
@@ -163,15 +402,6 @@
           <w:i/>
           <w:iCs/>
         </w:rPr>
-      </w:pPr>
-      <w:r>
-        <w:rPr>
-          <w:rFonts w:ascii="Times New Roman" w:hAnsi="Times New Roman" w:cs="Times New Roman"/>
-          <w:b/>
-          <w:bCs/>
-          <w:i/>
-          <w:iCs/>
-        </w:rPr>
         <w:t>Your fifth choice</w:t>
       </w:r>
     </w:p>
@@ -206,6 +436,7 @@
           <w:b/>
           <w:bCs/>
         </w:rPr>
+        <w:lastRenderedPageBreak/>
         <w:t>Results</w:t>
       </w:r>
     </w:p>

</xml_diff>

<commit_message>
Adding the graphic explanations to P2
</commit_message>
<xml_diff>
--- a/P2.docx
+++ b/P2.docx
@@ -11,6 +11,60 @@
       <w:r>
         <w:rPr>
           <w:rFonts w:ascii="Times New Roman" w:hAnsi="Times New Roman" w:cs="Times New Roman"/>
+          <w:noProof/>
+        </w:rPr>
+        <w:drawing>
+          <wp:inline distT="0" distB="0" distL="0" distR="0" wp14:anchorId="119801DE" wp14:editId="1ABCB22F">
+            <wp:extent cx="7924800" cy="5943600"/>
+            <wp:effectExtent l="0" t="0" r="0" b="0"/>
+            <wp:docPr id="1898383" name="Picture 1" descr="A piece of paper with writing on it&#10;&#10;AI-generated content may be incorrect."/>
+            <wp:cNvGraphicFramePr>
+              <a:graphicFrameLocks xmlns:a="http://schemas.openxmlformats.org/drawingml/2006/main" noChangeAspect="1"/>
+            </wp:cNvGraphicFramePr>
+            <a:graphic xmlns:a="http://schemas.openxmlformats.org/drawingml/2006/main">
+              <a:graphicData uri="http://schemas.openxmlformats.org/drawingml/2006/picture">
+                <pic:pic xmlns:pic="http://schemas.openxmlformats.org/drawingml/2006/picture">
+                  <pic:nvPicPr>
+                    <pic:cNvPr id="1898383" name="Picture 1" descr="A piece of paper with writing on it&#10;&#10;AI-generated content may be incorrect."/>
+                    <pic:cNvPicPr/>
+                  </pic:nvPicPr>
+                  <pic:blipFill>
+                    <a:blip r:embed="rId5" cstate="print">
+                      <a:extLst>
+                        <a:ext uri="{28A0092B-C50C-407E-A947-70E740481C1C}">
+                          <a14:useLocalDpi xmlns:a14="http://schemas.microsoft.com/office/drawing/2010/main" val="0"/>
+                        </a:ext>
+                      </a:extLst>
+                    </a:blip>
+                    <a:stretch>
+                      <a:fillRect/>
+                    </a:stretch>
+                  </pic:blipFill>
+                  <pic:spPr>
+                    <a:xfrm rot="5400000">
+                      <a:off x="0" y="0"/>
+                      <a:ext cx="7924800" cy="5943600"/>
+                    </a:xfrm>
+                    <a:prstGeom prst="rect">
+                      <a:avLst/>
+                    </a:prstGeom>
+                  </pic:spPr>
+                </pic:pic>
+              </a:graphicData>
+            </a:graphic>
+          </wp:inline>
+        </w:drawing>
+      </w:r>
+    </w:p>
+    <w:p>
+      <w:pPr>
+        <w:rPr>
+          <w:rFonts w:ascii="Times New Roman" w:hAnsi="Times New Roman" w:cs="Times New Roman"/>
+        </w:rPr>
+      </w:pPr>
+      <w:r>
+        <w:rPr>
+          <w:rFonts w:ascii="Times New Roman" w:hAnsi="Times New Roman" w:cs="Times New Roman"/>
         </w:rPr>
         <w:t>Abstract: Approximately 100–200 words describing what the paper is about.</w:t>
       </w:r>
@@ -25,6 +79,7 @@
         <w:rPr>
           <w:rFonts w:ascii="Times New Roman" w:hAnsi="Times New Roman" w:cs="Times New Roman"/>
         </w:rPr>
+        <w:lastRenderedPageBreak/>
         <w:t xml:space="preserve">Introduction: Describe the background and give a textual (not </w:t>
       </w:r>
       <w:proofErr w:type="gramStart"/>
@@ -436,24 +491,24 @@
           <w:b/>
           <w:bCs/>
         </w:rPr>
+        <w:t>Results</w:t>
+      </w:r>
+    </w:p>
+    <w:p>
+      <w:pPr>
+        <w:rPr>
+          <w:rFonts w:ascii="Times New Roman" w:hAnsi="Times New Roman" w:cs="Times New Roman"/>
+          <w:b/>
+          <w:bCs/>
+        </w:rPr>
+      </w:pPr>
+      <w:r>
+        <w:rPr>
+          <w:rFonts w:ascii="Times New Roman" w:hAnsi="Times New Roman" w:cs="Times New Roman"/>
+          <w:b/>
+          <w:bCs/>
+        </w:rPr>
         <w:lastRenderedPageBreak/>
-        <w:t>Results</w:t>
-      </w:r>
-    </w:p>
-    <w:p>
-      <w:pPr>
-        <w:rPr>
-          <w:rFonts w:ascii="Times New Roman" w:hAnsi="Times New Roman" w:cs="Times New Roman"/>
-          <w:b/>
-          <w:bCs/>
-        </w:rPr>
-      </w:pPr>
-      <w:r>
-        <w:rPr>
-          <w:rFonts w:ascii="Times New Roman" w:hAnsi="Times New Roman" w:cs="Times New Roman"/>
-          <w:b/>
-          <w:bCs/>
-        </w:rPr>
         <w:t>Conclusions</w:t>
       </w:r>
     </w:p>

</xml_diff>

<commit_message>
Adding some summaries for every sorting.
</commit_message>
<xml_diff>
--- a/P2.docx
+++ b/P2.docx
@@ -80,21 +80,7 @@
           <w:rFonts w:ascii="Times New Roman" w:hAnsi="Times New Roman" w:cs="Times New Roman"/>
         </w:rPr>
         <w:lastRenderedPageBreak/>
-        <w:t xml:space="preserve">Introduction: Describe the background and give a textual (not </w:t>
-      </w:r>
-      <w:proofErr w:type="gramStart"/>
-      <w:r>
-        <w:rPr>
-          <w:rFonts w:ascii="Times New Roman" w:hAnsi="Times New Roman" w:cs="Times New Roman"/>
-        </w:rPr>
-        <w:t>bulleted</w:t>
-      </w:r>
-      <w:proofErr w:type="gramEnd"/>
-      <w:r>
-        <w:rPr>
-          <w:rFonts w:ascii="Times New Roman" w:hAnsi="Times New Roman" w:cs="Times New Roman"/>
-        </w:rPr>
-        <w:t>) outline of the paper</w:t>
+        <w:t>Introduction: Describe the background and give a textual (not bulleted) outline of the paper</w:t>
       </w:r>
     </w:p>
     <w:p>
@@ -116,19 +102,11 @@
           <w:rFonts w:ascii="Times New Roman" w:hAnsi="Times New Roman" w:cs="Times New Roman"/>
         </w:rPr>
       </w:pPr>
-      <w:proofErr w:type="gramStart"/>
-      <w:r>
-        <w:rPr>
-          <w:rFonts w:ascii="Times New Roman" w:hAnsi="Times New Roman" w:cs="Times New Roman"/>
-        </w:rPr>
-        <w:t>a textual</w:t>
-      </w:r>
-      <w:proofErr w:type="gramEnd"/>
-      <w:r>
-        <w:rPr>
-          <w:rFonts w:ascii="Times New Roman" w:hAnsi="Times New Roman" w:cs="Times New Roman"/>
-        </w:rPr>
-        <w:t xml:space="preserve"> description of how it works</w:t>
+      <w:r>
+        <w:rPr>
+          <w:rFonts w:ascii="Times New Roman" w:hAnsi="Times New Roman" w:cs="Times New Roman"/>
+        </w:rPr>
+        <w:t>a textual description of how it works</w:t>
       </w:r>
     </w:p>
     <w:p>
@@ -180,21 +158,7 @@
         <w:rPr>
           <w:rFonts w:ascii="Times New Roman" w:hAnsi="Times New Roman" w:cs="Times New Roman"/>
         </w:rPr>
-        <w:t xml:space="preserve">Conclusions: Summarize the paper and provide a </w:t>
-      </w:r>
-      <w:proofErr w:type="gramStart"/>
-      <w:r>
-        <w:rPr>
-          <w:rFonts w:ascii="Times New Roman" w:hAnsi="Times New Roman" w:cs="Times New Roman"/>
-        </w:rPr>
-        <w:t>launching</w:t>
-      </w:r>
-      <w:proofErr w:type="gramEnd"/>
-      <w:r>
-        <w:rPr>
-          <w:rFonts w:ascii="Times New Roman" w:hAnsi="Times New Roman" w:cs="Times New Roman"/>
-        </w:rPr>
-        <w:t xml:space="preserve"> point for further discussion.</w:t>
+        <w:t>Conclusions: Summarize the paper and provide a launching point for further discussion.</w:t>
       </w:r>
     </w:p>
     <w:p>
@@ -233,21 +197,7 @@
         <w:rPr>
           <w:rFonts w:ascii="Times New Roman" w:hAnsi="Times New Roman" w:cs="Times New Roman"/>
         </w:rPr>
-        <w:t xml:space="preserve">Any time that you are using ideas or words from another source, you absolutely </w:t>
-      </w:r>
-      <w:proofErr w:type="gramStart"/>
-      <w:r>
-        <w:rPr>
-          <w:rFonts w:ascii="Times New Roman" w:hAnsi="Times New Roman" w:cs="Times New Roman"/>
-        </w:rPr>
-        <w:t>have to</w:t>
-      </w:r>
-      <w:proofErr w:type="gramEnd"/>
-      <w:r>
-        <w:rPr>
-          <w:rFonts w:ascii="Times New Roman" w:hAnsi="Times New Roman" w:cs="Times New Roman"/>
-        </w:rPr>
-        <w:t xml:space="preserve"> cite that source in-text, like “On average, a binary search tree with n keys generated from a random series of insertions and removals of keys has expected height O(</w:t>
+        <w:t>Any time that you are using ideas or words from another source, you absolutely have to cite that source in-text, like “On average, a binary search tree with n keys generated from a random series of insertions and removals of keys has expected height O(</w:t>
       </w:r>
       <w:proofErr w:type="spellStart"/>
       <w:r>
@@ -330,6 +280,13 @@
         </w:rPr>
         <w:t>Introduction</w:t>
       </w:r>
+    </w:p>
+    <w:p>
+      <w:pPr>
+        <w:rPr>
+          <w:rFonts w:ascii="Times New Roman" w:hAnsi="Times New Roman" w:cs="Times New Roman"/>
+        </w:rPr>
+      </w:pPr>
     </w:p>
     <w:p>
       <w:pPr>
@@ -370,10 +327,25 @@
           <w:i/>
           <w:iCs/>
         </w:rPr>
-        <w:t xml:space="preserve">Merge </w:t>
-      </w:r>
-      <w:proofErr w:type="gramStart"/>
-      <w:r>
+        <w:t>Merge sort</w:t>
+      </w:r>
+    </w:p>
+    <w:p>
+      <w:pPr>
+        <w:rPr>
+          <w:rFonts w:ascii="Times New Roman" w:hAnsi="Times New Roman" w:cs="Times New Roman"/>
+        </w:rPr>
+      </w:pPr>
+      <w:r>
+        <w:rPr>
+          <w:rFonts w:ascii="Times New Roman" w:hAnsi="Times New Roman" w:cs="Times New Roman"/>
+        </w:rPr>
+        <w:tab/>
+        <w:t>It starts by dividing the elements half and then keep recursively dividing until they are only one. Then we merge them comparing  the numbers.</w:t>
+      </w:r>
+    </w:p>
+    <w:p>
+      <w:pPr>
         <w:rPr>
           <w:rFonts w:ascii="Times New Roman" w:hAnsi="Times New Roman" w:cs="Times New Roman"/>
           <w:b/>
@@ -381,12 +353,8 @@
           <w:i/>
           <w:iCs/>
         </w:rPr>
-        <w:t>sort</w:t>
-      </w:r>
-      <w:proofErr w:type="gramEnd"/>
-    </w:p>
-    <w:p>
-      <w:pPr>
+      </w:pPr>
+      <w:r>
         <w:rPr>
           <w:rFonts w:ascii="Times New Roman" w:hAnsi="Times New Roman" w:cs="Times New Roman"/>
           <w:b/>
@@ -394,6 +362,14 @@
           <w:i/>
           <w:iCs/>
         </w:rPr>
+        <w:t>Quicksort</w:t>
+      </w:r>
+    </w:p>
+    <w:p>
+      <w:pPr>
+        <w:rPr>
+          <w:rFonts w:ascii="Times New Roman" w:hAnsi="Times New Roman" w:cs="Times New Roman"/>
+        </w:rPr>
       </w:pPr>
       <w:r>
         <w:rPr>
@@ -403,7 +379,19 @@
           <w:i/>
           <w:iCs/>
         </w:rPr>
-        <w:t>Quicksort</w:t>
+        <w:tab/>
+      </w:r>
+      <w:r>
+        <w:rPr>
+          <w:rFonts w:ascii="Times New Roman" w:hAnsi="Times New Roman" w:cs="Times New Roman"/>
+        </w:rPr>
+        <w:t xml:space="preserve">You get a pivot. Then divide between </w:t>
+      </w:r>
+      <w:r>
+        <w:rPr>
+          <w:rFonts w:ascii="Times New Roman" w:hAnsi="Times New Roman" w:cs="Times New Roman"/>
+        </w:rPr>
+        <w:t>lesser and greater numbers and the reassemble backwards.</w:t>
       </w:r>
     </w:p>
     <w:p>
@@ -424,9 +412,16 @@
           <w:i/>
           <w:iCs/>
         </w:rPr>
-        <w:t xml:space="preserve">Tree </w:t>
-      </w:r>
-      <w:proofErr w:type="gramStart"/>
+        <w:lastRenderedPageBreak/>
+        <w:t>Tree sort</w:t>
+      </w:r>
+    </w:p>
+    <w:p>
+      <w:pPr>
+        <w:rPr>
+          <w:rFonts w:ascii="Times New Roman" w:hAnsi="Times New Roman" w:cs="Times New Roman"/>
+        </w:rPr>
+      </w:pPr>
       <w:r>
         <w:rPr>
           <w:rFonts w:ascii="Times New Roman" w:hAnsi="Times New Roman" w:cs="Times New Roman"/>
@@ -435,9 +430,14 @@
           <w:i/>
           <w:iCs/>
         </w:rPr>
-        <w:t>sort</w:t>
-      </w:r>
-      <w:proofErr w:type="gramEnd"/>
+        <w:tab/>
+      </w:r>
+      <w:r>
+        <w:rPr>
+          <w:rFonts w:ascii="Times New Roman" w:hAnsi="Times New Roman" w:cs="Times New Roman"/>
+        </w:rPr>
+        <w:t xml:space="preserve">Sort them into a binary search tree. Then just do in sort traversal to get the order. </w:t>
+      </w:r>
     </w:p>
     <w:p>
       <w:pPr>
@@ -508,7 +508,6 @@
           <w:b/>
           <w:bCs/>
         </w:rPr>
-        <w:lastRenderedPageBreak/>
         <w:t>Conclusions</w:t>
       </w:r>
     </w:p>

</xml_diff>

<commit_message>
Adding more detail to P2 descriptions for the different sorting algorithms.
</commit_message>
<xml_diff>
--- a/P2.docx
+++ b/P2.docx
@@ -14,10 +14,10 @@
           <w:noProof/>
         </w:rPr>
         <w:drawing>
-          <wp:inline distT="0" distB="0" distL="0" distR="0" wp14:anchorId="119801DE" wp14:editId="1ABCB22F">
-            <wp:extent cx="7924800" cy="5943600"/>
-            <wp:effectExtent l="0" t="0" r="0" b="0"/>
-            <wp:docPr id="1898383" name="Picture 1" descr="A piece of paper with writing on it&#10;&#10;AI-generated content may be incorrect."/>
+          <wp:inline distT="0" distB="0" distL="0" distR="0" wp14:anchorId="5FA20885" wp14:editId="3B6D245F">
+            <wp:extent cx="5943600" cy="7695565"/>
+            <wp:effectExtent l="0" t="0" r="0" b="635"/>
+            <wp:docPr id="2032015158" name="Picture 1" descr="A close-up of a white paper&#10;&#10;AI-generated content may be incorrect."/>
             <wp:cNvGraphicFramePr>
               <a:graphicFrameLocks xmlns:a="http://schemas.openxmlformats.org/drawingml/2006/main" noChangeAspect="1"/>
             </wp:cNvGraphicFramePr>
@@ -25,7 +25,7 @@
               <a:graphicData uri="http://schemas.openxmlformats.org/drawingml/2006/picture">
                 <pic:pic xmlns:pic="http://schemas.openxmlformats.org/drawingml/2006/picture">
                   <pic:nvPicPr>
-                    <pic:cNvPr id="1898383" name="Picture 1" descr="A piece of paper with writing on it&#10;&#10;AI-generated content may be incorrect."/>
+                    <pic:cNvPr id="2032015158" name="Picture 1" descr="A close-up of a white paper&#10;&#10;AI-generated content may be incorrect."/>
                     <pic:cNvPicPr/>
                   </pic:nvPicPr>
                   <pic:blipFill>
@@ -41,9 +41,9 @@
                     </a:stretch>
                   </pic:blipFill>
                   <pic:spPr>
-                    <a:xfrm rot="5400000">
+                    <a:xfrm>
                       <a:off x="0" y="0"/>
-                      <a:ext cx="7924800" cy="5943600"/>
+                      <a:ext cx="5943600" cy="7695565"/>
                     </a:xfrm>
                     <a:prstGeom prst="rect">
                       <a:avLst/>
@@ -80,7 +80,21 @@
           <w:rFonts w:ascii="Times New Roman" w:hAnsi="Times New Roman" w:cs="Times New Roman"/>
         </w:rPr>
         <w:lastRenderedPageBreak/>
-        <w:t>Introduction: Describe the background and give a textual (not bulleted) outline of the paper</w:t>
+        <w:t xml:space="preserve">Introduction: Describe the background and give a textual (not </w:t>
+      </w:r>
+      <w:proofErr w:type="gramStart"/>
+      <w:r>
+        <w:rPr>
+          <w:rFonts w:ascii="Times New Roman" w:hAnsi="Times New Roman" w:cs="Times New Roman"/>
+        </w:rPr>
+        <w:t>bulleted</w:t>
+      </w:r>
+      <w:proofErr w:type="gramEnd"/>
+      <w:r>
+        <w:rPr>
+          <w:rFonts w:ascii="Times New Roman" w:hAnsi="Times New Roman" w:cs="Times New Roman"/>
+        </w:rPr>
+        <w:t>) outline of the paper</w:t>
       </w:r>
     </w:p>
     <w:p>
@@ -102,11 +116,19 @@
           <w:rFonts w:ascii="Times New Roman" w:hAnsi="Times New Roman" w:cs="Times New Roman"/>
         </w:rPr>
       </w:pPr>
-      <w:r>
-        <w:rPr>
-          <w:rFonts w:ascii="Times New Roman" w:hAnsi="Times New Roman" w:cs="Times New Roman"/>
-        </w:rPr>
-        <w:t>a textual description of how it works</w:t>
+      <w:proofErr w:type="gramStart"/>
+      <w:r>
+        <w:rPr>
+          <w:rFonts w:ascii="Times New Roman" w:hAnsi="Times New Roman" w:cs="Times New Roman"/>
+        </w:rPr>
+        <w:t>a textual</w:t>
+      </w:r>
+      <w:proofErr w:type="gramEnd"/>
+      <w:r>
+        <w:rPr>
+          <w:rFonts w:ascii="Times New Roman" w:hAnsi="Times New Roman" w:cs="Times New Roman"/>
+        </w:rPr>
+        <w:t xml:space="preserve"> description of how it works</w:t>
       </w:r>
     </w:p>
     <w:p>
@@ -158,7 +180,21 @@
         <w:rPr>
           <w:rFonts w:ascii="Times New Roman" w:hAnsi="Times New Roman" w:cs="Times New Roman"/>
         </w:rPr>
-        <w:t>Conclusions: Summarize the paper and provide a launching point for further discussion.</w:t>
+        <w:t xml:space="preserve">Conclusions: Summarize the paper and provide a </w:t>
+      </w:r>
+      <w:proofErr w:type="gramStart"/>
+      <w:r>
+        <w:rPr>
+          <w:rFonts w:ascii="Times New Roman" w:hAnsi="Times New Roman" w:cs="Times New Roman"/>
+        </w:rPr>
+        <w:t>launching</w:t>
+      </w:r>
+      <w:proofErr w:type="gramEnd"/>
+      <w:r>
+        <w:rPr>
+          <w:rFonts w:ascii="Times New Roman" w:hAnsi="Times New Roman" w:cs="Times New Roman"/>
+        </w:rPr>
+        <w:t xml:space="preserve"> point for further discussion.</w:t>
       </w:r>
     </w:p>
     <w:p>
@@ -197,7 +233,21 @@
         <w:rPr>
           <w:rFonts w:ascii="Times New Roman" w:hAnsi="Times New Roman" w:cs="Times New Roman"/>
         </w:rPr>
-        <w:t>Any time that you are using ideas or words from another source, you absolutely have to cite that source in-text, like “On average, a binary search tree with n keys generated from a random series of insertions and removals of keys has expected height O(</w:t>
+        <w:t xml:space="preserve">Any time that you are using ideas or words from another source, you absolutely </w:t>
+      </w:r>
+      <w:proofErr w:type="gramStart"/>
+      <w:r>
+        <w:rPr>
+          <w:rFonts w:ascii="Times New Roman" w:hAnsi="Times New Roman" w:cs="Times New Roman"/>
+        </w:rPr>
+        <w:t>have to</w:t>
+      </w:r>
+      <w:proofErr w:type="gramEnd"/>
+      <w:r>
+        <w:rPr>
+          <w:rFonts w:ascii="Times New Roman" w:hAnsi="Times New Roman" w:cs="Times New Roman"/>
+        </w:rPr>
+        <w:t xml:space="preserve"> cite that source in-text, like “On average, a binary search tree with n keys generated from a random series of insertions and removals of keys has expected height O(</w:t>
       </w:r>
       <w:proofErr w:type="spellStart"/>
       <w:r>
@@ -313,13 +363,21 @@
       <w:pPr>
         <w:rPr>
           <w:rFonts w:ascii="Times New Roman" w:hAnsi="Times New Roman" w:cs="Times New Roman"/>
+        </w:rPr>
+      </w:pPr>
+      <w:r>
+        <w:rPr>
+          <w:rFonts w:ascii="Times New Roman" w:hAnsi="Times New Roman" w:cs="Times New Roman"/>
           <w:b/>
           <w:bCs/>
           <w:i/>
           <w:iCs/>
         </w:rPr>
-      </w:pPr>
-      <w:r>
+        <w:tab/>
+      </w:r>
+    </w:p>
+    <w:p>
+      <w:pPr>
         <w:rPr>
           <w:rFonts w:ascii="Times New Roman" w:hAnsi="Times New Roman" w:cs="Times New Roman"/>
           <w:b/>
@@ -327,25 +385,8 @@
           <w:i/>
           <w:iCs/>
         </w:rPr>
-        <w:t>Merge sort</w:t>
-      </w:r>
-    </w:p>
-    <w:p>
-      <w:pPr>
-        <w:rPr>
-          <w:rFonts w:ascii="Times New Roman" w:hAnsi="Times New Roman" w:cs="Times New Roman"/>
-        </w:rPr>
-      </w:pPr>
-      <w:r>
-        <w:rPr>
-          <w:rFonts w:ascii="Times New Roman" w:hAnsi="Times New Roman" w:cs="Times New Roman"/>
-        </w:rPr>
-        <w:tab/>
-        <w:t>It starts by dividing the elements half and then keep recursively dividing until they are only one. Then we merge them comparing  the numbers.</w:t>
-      </w:r>
-    </w:p>
-    <w:p>
-      <w:pPr>
+      </w:pPr>
+      <w:r>
         <w:rPr>
           <w:rFonts w:ascii="Times New Roman" w:hAnsi="Times New Roman" w:cs="Times New Roman"/>
           <w:b/>
@@ -353,7 +394,9 @@
           <w:i/>
           <w:iCs/>
         </w:rPr>
-      </w:pPr>
+        <w:t xml:space="preserve">Merge </w:t>
+      </w:r>
+      <w:proofErr w:type="gramStart"/>
       <w:r>
         <w:rPr>
           <w:rFonts w:ascii="Times New Roman" w:hAnsi="Times New Roman" w:cs="Times New Roman"/>
@@ -362,16 +405,68 @@
           <w:i/>
           <w:iCs/>
         </w:rPr>
-        <w:t>Quicksort</w:t>
-      </w:r>
-    </w:p>
-    <w:p>
-      <w:pPr>
-        <w:rPr>
-          <w:rFonts w:ascii="Times New Roman" w:hAnsi="Times New Roman" w:cs="Times New Roman"/>
-        </w:rPr>
-      </w:pPr>
-      <w:r>
+        <w:t>sort</w:t>
+      </w:r>
+      <w:proofErr w:type="gramEnd"/>
+    </w:p>
+    <w:p>
+      <w:pPr>
+        <w:rPr>
+          <w:rFonts w:ascii="Times New Roman" w:hAnsi="Times New Roman" w:cs="Times New Roman"/>
+        </w:rPr>
+      </w:pPr>
+      <w:r>
+        <w:rPr>
+          <w:rFonts w:ascii="Times New Roman" w:hAnsi="Times New Roman" w:cs="Times New Roman"/>
+        </w:rPr>
+        <w:tab/>
+        <w:t xml:space="preserve">It starts by dividing the </w:t>
+      </w:r>
+      <w:proofErr w:type="gramStart"/>
+      <w:r>
+        <w:rPr>
+          <w:rFonts w:ascii="Times New Roman" w:hAnsi="Times New Roman" w:cs="Times New Roman"/>
+        </w:rPr>
+        <w:t>elements</w:t>
+      </w:r>
+      <w:proofErr w:type="gramEnd"/>
+      <w:r>
+        <w:rPr>
+          <w:rFonts w:ascii="Times New Roman" w:hAnsi="Times New Roman" w:cs="Times New Roman"/>
+        </w:rPr>
+        <w:t xml:space="preserve"> half and then </w:t>
+      </w:r>
+      <w:proofErr w:type="gramStart"/>
+      <w:r>
+        <w:rPr>
+          <w:rFonts w:ascii="Times New Roman" w:hAnsi="Times New Roman" w:cs="Times New Roman"/>
+        </w:rPr>
+        <w:t>keep</w:t>
+      </w:r>
+      <w:proofErr w:type="gramEnd"/>
+      <w:r>
+        <w:rPr>
+          <w:rFonts w:ascii="Times New Roman" w:hAnsi="Times New Roman" w:cs="Times New Roman"/>
+        </w:rPr>
+        <w:t xml:space="preserve"> recursively dividing until they are only one. Then we merge them </w:t>
+      </w:r>
+      <w:proofErr w:type="gramStart"/>
+      <w:r>
+        <w:rPr>
+          <w:rFonts w:ascii="Times New Roman" w:hAnsi="Times New Roman" w:cs="Times New Roman"/>
+        </w:rPr>
+        <w:t>comparing  the</w:t>
+      </w:r>
+      <w:proofErr w:type="gramEnd"/>
+      <w:r>
+        <w:rPr>
+          <w:rFonts w:ascii="Times New Roman" w:hAnsi="Times New Roman" w:cs="Times New Roman"/>
+        </w:rPr>
+        <w:t xml:space="preserve"> numbers.</w:t>
+      </w:r>
+    </w:p>
+    <w:p>
+      <w:pPr>
         <w:rPr>
           <w:rFonts w:ascii="Times New Roman" w:hAnsi="Times New Roman" w:cs="Times New Roman"/>
           <w:b/>
@@ -379,23 +474,8 @@
           <w:i/>
           <w:iCs/>
         </w:rPr>
-        <w:tab/>
-      </w:r>
-      <w:r>
-        <w:rPr>
-          <w:rFonts w:ascii="Times New Roman" w:hAnsi="Times New Roman" w:cs="Times New Roman"/>
-        </w:rPr>
-        <w:t xml:space="preserve">You get a pivot. Then divide between </w:t>
-      </w:r>
-      <w:r>
-        <w:rPr>
-          <w:rFonts w:ascii="Times New Roman" w:hAnsi="Times New Roman" w:cs="Times New Roman"/>
-        </w:rPr>
-        <w:t>lesser and greater numbers and the reassemble backwards.</w:t>
-      </w:r>
-    </w:p>
-    <w:p>
-      <w:pPr>
+      </w:pPr>
+      <w:r>
         <w:rPr>
           <w:rFonts w:ascii="Times New Roman" w:hAnsi="Times New Roman" w:cs="Times New Roman"/>
           <w:b/>
@@ -403,6 +483,14 @@
           <w:i/>
           <w:iCs/>
         </w:rPr>
+        <w:t>Quicksort</w:t>
+      </w:r>
+    </w:p>
+    <w:p>
+      <w:pPr>
+        <w:rPr>
+          <w:rFonts w:ascii="Times New Roman" w:hAnsi="Times New Roman" w:cs="Times New Roman"/>
+        </w:rPr>
       </w:pPr>
       <w:r>
         <w:rPr>
@@ -413,16 +501,23 @@
           <w:iCs/>
         </w:rPr>
         <w:lastRenderedPageBreak/>
-        <w:t>Tree sort</w:t>
-      </w:r>
-    </w:p>
-    <w:p>
-      <w:pPr>
-        <w:rPr>
-          <w:rFonts w:ascii="Times New Roman" w:hAnsi="Times New Roman" w:cs="Times New Roman"/>
-        </w:rPr>
-      </w:pPr>
-      <w:r>
+        <w:tab/>
+      </w:r>
+      <w:r>
+        <w:rPr>
+          <w:rFonts w:ascii="Times New Roman" w:hAnsi="Times New Roman" w:cs="Times New Roman"/>
+        </w:rPr>
+        <w:t xml:space="preserve">You get a pivot. Then divide between </w:t>
+      </w:r>
+      <w:r>
+        <w:rPr>
+          <w:rFonts w:ascii="Times New Roman" w:hAnsi="Times New Roman" w:cs="Times New Roman"/>
+        </w:rPr>
+        <w:t>lesser and greater numbers and the reassemble backwards.</w:t>
+      </w:r>
+    </w:p>
+    <w:p>
+      <w:pPr>
         <w:rPr>
           <w:rFonts w:ascii="Times New Roman" w:hAnsi="Times New Roman" w:cs="Times New Roman"/>
           <w:b/>
@@ -430,17 +525,8 @@
           <w:i/>
           <w:iCs/>
         </w:rPr>
-        <w:tab/>
-      </w:r>
-      <w:r>
-        <w:rPr>
-          <w:rFonts w:ascii="Times New Roman" w:hAnsi="Times New Roman" w:cs="Times New Roman"/>
-        </w:rPr>
-        <w:t xml:space="preserve">Sort them into a binary search tree. Then just do in sort traversal to get the order. </w:t>
-      </w:r>
-    </w:p>
-    <w:p>
-      <w:pPr>
+      </w:pPr>
+      <w:r>
         <w:rPr>
           <w:rFonts w:ascii="Times New Roman" w:hAnsi="Times New Roman" w:cs="Times New Roman"/>
           <w:b/>
@@ -448,7 +534,9 @@
           <w:i/>
           <w:iCs/>
         </w:rPr>
-      </w:pPr>
+        <w:t xml:space="preserve">Tree </w:t>
+      </w:r>
+      <w:proofErr w:type="gramStart"/>
       <w:r>
         <w:rPr>
           <w:rFonts w:ascii="Times New Roman" w:hAnsi="Times New Roman" w:cs="Times New Roman"/>
@@ -457,6 +545,51 @@
           <w:i/>
           <w:iCs/>
         </w:rPr>
+        <w:t>sort</w:t>
+      </w:r>
+      <w:proofErr w:type="gramEnd"/>
+    </w:p>
+    <w:p>
+      <w:pPr>
+        <w:rPr>
+          <w:rFonts w:ascii="Times New Roman" w:hAnsi="Times New Roman" w:cs="Times New Roman"/>
+        </w:rPr>
+      </w:pPr>
+      <w:r>
+        <w:rPr>
+          <w:rFonts w:ascii="Times New Roman" w:hAnsi="Times New Roman" w:cs="Times New Roman"/>
+          <w:b/>
+          <w:bCs/>
+          <w:i/>
+          <w:iCs/>
+        </w:rPr>
+        <w:tab/>
+      </w:r>
+      <w:r>
+        <w:rPr>
+          <w:rFonts w:ascii="Times New Roman" w:hAnsi="Times New Roman" w:cs="Times New Roman"/>
+        </w:rPr>
+        <w:t xml:space="preserve">Sort them into a binary search tree. Then just do in sort traversal to get the order. </w:t>
+      </w:r>
+    </w:p>
+    <w:p>
+      <w:pPr>
+        <w:rPr>
+          <w:rFonts w:ascii="Times New Roman" w:hAnsi="Times New Roman" w:cs="Times New Roman"/>
+          <w:b/>
+          <w:bCs/>
+          <w:i/>
+          <w:iCs/>
+        </w:rPr>
+      </w:pPr>
+      <w:r>
+        <w:rPr>
+          <w:rFonts w:ascii="Times New Roman" w:hAnsi="Times New Roman" w:cs="Times New Roman"/>
+          <w:b/>
+          <w:bCs/>
+          <w:i/>
+          <w:iCs/>
+        </w:rPr>
         <w:t>Your fifth choice</w:t>
       </w:r>
     </w:p>
@@ -475,6 +608,49 @@
           <w:bCs/>
         </w:rPr>
         <w:t>Methodology</w:t>
+      </w:r>
+    </w:p>
+    <w:p>
+      <w:pPr>
+        <w:rPr>
+          <w:rFonts w:ascii="Times New Roman" w:hAnsi="Times New Roman" w:cs="Times New Roman"/>
+        </w:rPr>
+      </w:pPr>
+      <w:r>
+        <w:rPr>
+          <w:rFonts w:ascii="Times New Roman" w:hAnsi="Times New Roman" w:cs="Times New Roman"/>
+          <w:b/>
+          <w:bCs/>
+        </w:rPr>
+        <w:tab/>
+      </w:r>
+      <w:proofErr w:type="gramStart"/>
+      <w:r>
+        <w:rPr>
+          <w:rFonts w:ascii="Times New Roman" w:hAnsi="Times New Roman" w:cs="Times New Roman"/>
+        </w:rPr>
+        <w:t>Basically</w:t>
+      </w:r>
+      <w:proofErr w:type="gramEnd"/>
+      <w:r>
+        <w:rPr>
+          <w:rFonts w:ascii="Times New Roman" w:hAnsi="Times New Roman" w:cs="Times New Roman"/>
+        </w:rPr>
+        <w:t xml:space="preserve"> for the methodology we are creating 20,000 random integers and then sorting them under the different sorting algorithms, we will compare who does less </w:t>
+      </w:r>
+      <w:proofErr w:type="gramStart"/>
+      <w:r>
+        <w:rPr>
+          <w:rFonts w:ascii="Times New Roman" w:hAnsi="Times New Roman" w:cs="Times New Roman"/>
+        </w:rPr>
+        <w:t>element to element</w:t>
+      </w:r>
+      <w:proofErr w:type="gramEnd"/>
+      <w:r>
+        <w:rPr>
+          <w:rFonts w:ascii="Times New Roman" w:hAnsi="Times New Roman" w:cs="Times New Roman"/>
+        </w:rPr>
+        <w:t xml:space="preserve"> comparisons. </w:t>
       </w:r>
     </w:p>
     <w:p>

</xml_diff>

<commit_message>
Adjusting the format of the images used for the different methods
</commit_message>
<xml_diff>
--- a/P2.docx
+++ b/P2.docx
@@ -14,9 +14,177 @@
           <w:noProof/>
         </w:rPr>
         <w:drawing>
-          <wp:inline distT="0" distB="0" distL="0" distR="0" wp14:anchorId="5FA20885" wp14:editId="3B6D245F">
-            <wp:extent cx="5943600" cy="7695565"/>
-            <wp:effectExtent l="0" t="0" r="0" b="635"/>
+          <wp:inline distT="0" distB="0" distL="0" distR="0" wp14:anchorId="69D32377" wp14:editId="5E8A2173">
+            <wp:extent cx="2400300" cy="3799840"/>
+            <wp:effectExtent l="0" t="0" r="0" b="0"/>
+            <wp:docPr id="1614583903" name="Picture 1" descr="A close-up of a white paper&#10;&#10;AI-generated content may be incorrect."/>
+            <wp:cNvGraphicFramePr>
+              <a:graphicFrameLocks xmlns:a="http://schemas.openxmlformats.org/drawingml/2006/main" noChangeAspect="1"/>
+            </wp:cNvGraphicFramePr>
+            <a:graphic xmlns:a="http://schemas.openxmlformats.org/drawingml/2006/main">
+              <a:graphicData uri="http://schemas.openxmlformats.org/drawingml/2006/picture">
+                <pic:pic xmlns:pic="http://schemas.openxmlformats.org/drawingml/2006/picture">
+                  <pic:nvPicPr>
+                    <pic:cNvPr id="2032015158" name="Picture 1" descr="A close-up of a white paper&#10;&#10;AI-generated content may be incorrect."/>
+                    <pic:cNvPicPr/>
+                  </pic:nvPicPr>
+                  <pic:blipFill rotWithShape="1">
+                    <a:blip r:embed="rId5" cstate="print">
+                      <a:extLst>
+                        <a:ext uri="{28A0092B-C50C-407E-A947-70E740481C1C}">
+                          <a14:useLocalDpi xmlns:a14="http://schemas.microsoft.com/office/drawing/2010/main" val="0"/>
+                        </a:ext>
+                      </a:extLst>
+                    </a:blip>
+                    <a:srcRect l="59615" t="50623"/>
+                    <a:stretch>
+                      <a:fillRect/>
+                    </a:stretch>
+                  </pic:blipFill>
+                  <pic:spPr bwMode="auto">
+                    <a:xfrm>
+                      <a:off x="0" y="0"/>
+                      <a:ext cx="2400300" cy="3799840"/>
+                    </a:xfrm>
+                    <a:prstGeom prst="rect">
+                      <a:avLst/>
+                    </a:prstGeom>
+                    <a:ln>
+                      <a:noFill/>
+                    </a:ln>
+                    <a:extLst>
+                      <a:ext uri="{53640926-AAD7-44D8-BBD7-CCE9431645EC}">
+                        <a14:shadowObscured xmlns:a14="http://schemas.microsoft.com/office/drawing/2010/main"/>
+                      </a:ext>
+                    </a:extLst>
+                  </pic:spPr>
+                </pic:pic>
+              </a:graphicData>
+            </a:graphic>
+          </wp:inline>
+        </w:drawing>
+      </w:r>
+      <w:r>
+        <w:rPr>
+          <w:rFonts w:ascii="Times New Roman" w:hAnsi="Times New Roman" w:cs="Times New Roman"/>
+          <w:noProof/>
+        </w:rPr>
+        <w:drawing>
+          <wp:inline distT="0" distB="0" distL="0" distR="0" wp14:anchorId="78E4D3F6" wp14:editId="1BF8ECB2">
+            <wp:extent cx="2921000" cy="3538332"/>
+            <wp:effectExtent l="0" t="0" r="0" b="5080"/>
+            <wp:docPr id="1198555381" name="Picture 1" descr="A close-up of a white paper&#10;&#10;AI-generated content may be incorrect."/>
+            <wp:cNvGraphicFramePr>
+              <a:graphicFrameLocks xmlns:a="http://schemas.openxmlformats.org/drawingml/2006/main" noChangeAspect="1"/>
+            </wp:cNvGraphicFramePr>
+            <a:graphic xmlns:a="http://schemas.openxmlformats.org/drawingml/2006/main">
+              <a:graphicData uri="http://schemas.openxmlformats.org/drawingml/2006/picture">
+                <pic:pic xmlns:pic="http://schemas.openxmlformats.org/drawingml/2006/picture">
+                  <pic:nvPicPr>
+                    <pic:cNvPr id="2032015158" name="Picture 1" descr="A close-up of a white paper&#10;&#10;AI-generated content may be incorrect."/>
+                    <pic:cNvPicPr/>
+                  </pic:nvPicPr>
+                  <pic:blipFill rotWithShape="1">
+                    <a:blip r:embed="rId5" cstate="print">
+                      <a:extLst>
+                        <a:ext uri="{28A0092B-C50C-407E-A947-70E740481C1C}">
+                          <a14:useLocalDpi xmlns:a14="http://schemas.microsoft.com/office/drawing/2010/main" val="0"/>
+                        </a:ext>
+                      </a:extLst>
+                    </a:blip>
+                    <a:srcRect t="54016" r="50849"/>
+                    <a:stretch>
+                      <a:fillRect/>
+                    </a:stretch>
+                  </pic:blipFill>
+                  <pic:spPr bwMode="auto">
+                    <a:xfrm>
+                      <a:off x="0" y="0"/>
+                      <a:ext cx="2921330" cy="3538732"/>
+                    </a:xfrm>
+                    <a:prstGeom prst="rect">
+                      <a:avLst/>
+                    </a:prstGeom>
+                    <a:ln>
+                      <a:noFill/>
+                    </a:ln>
+                    <a:extLst>
+                      <a:ext uri="{53640926-AAD7-44D8-BBD7-CCE9431645EC}">
+                        <a14:shadowObscured xmlns:a14="http://schemas.microsoft.com/office/drawing/2010/main"/>
+                      </a:ext>
+                    </a:extLst>
+                  </pic:spPr>
+                </pic:pic>
+              </a:graphicData>
+            </a:graphic>
+          </wp:inline>
+        </w:drawing>
+      </w:r>
+      <w:r>
+        <w:rPr>
+          <w:rFonts w:ascii="Times New Roman" w:hAnsi="Times New Roman" w:cs="Times New Roman"/>
+          <w:noProof/>
+        </w:rPr>
+        <w:drawing>
+          <wp:inline distT="0" distB="0" distL="0" distR="0" wp14:anchorId="47899422" wp14:editId="714D8763">
+            <wp:extent cx="3764280" cy="1851831"/>
+            <wp:effectExtent l="0" t="0" r="7620" b="0"/>
+            <wp:docPr id="1151744676" name="Picture 1" descr="A close-up of a white paper&#10;&#10;AI-generated content may be incorrect."/>
+            <wp:cNvGraphicFramePr>
+              <a:graphicFrameLocks xmlns:a="http://schemas.openxmlformats.org/drawingml/2006/main" noChangeAspect="1"/>
+            </wp:cNvGraphicFramePr>
+            <a:graphic xmlns:a="http://schemas.openxmlformats.org/drawingml/2006/main">
+              <a:graphicData uri="http://schemas.openxmlformats.org/drawingml/2006/picture">
+                <pic:pic xmlns:pic="http://schemas.openxmlformats.org/drawingml/2006/picture">
+                  <pic:nvPicPr>
+                    <pic:cNvPr id="2032015158" name="Picture 1" descr="A close-up of a white paper&#10;&#10;AI-generated content may be incorrect."/>
+                    <pic:cNvPicPr/>
+                  </pic:nvPicPr>
+                  <pic:blipFill rotWithShape="1">
+                    <a:blip r:embed="rId5" cstate="print">
+                      <a:extLst>
+                        <a:ext uri="{28A0092B-C50C-407E-A947-70E740481C1C}">
+                          <a14:useLocalDpi xmlns:a14="http://schemas.microsoft.com/office/drawing/2010/main" val="0"/>
+                        </a:ext>
+                      </a:extLst>
+                    </a:blip>
+                    <a:srcRect t="25621" r="36654" b="50311"/>
+                    <a:stretch>
+                      <a:fillRect/>
+                    </a:stretch>
+                  </pic:blipFill>
+                  <pic:spPr bwMode="auto">
+                    <a:xfrm>
+                      <a:off x="0" y="0"/>
+                      <a:ext cx="3764990" cy="1852180"/>
+                    </a:xfrm>
+                    <a:prstGeom prst="rect">
+                      <a:avLst/>
+                    </a:prstGeom>
+                    <a:ln>
+                      <a:noFill/>
+                    </a:ln>
+                    <a:extLst>
+                      <a:ext uri="{53640926-AAD7-44D8-BBD7-CCE9431645EC}">
+                        <a14:shadowObscured xmlns:a14="http://schemas.microsoft.com/office/drawing/2010/main"/>
+                      </a:ext>
+                    </a:extLst>
+                  </pic:spPr>
+                </pic:pic>
+              </a:graphicData>
+            </a:graphic>
+          </wp:inline>
+        </w:drawing>
+      </w:r>
+      <w:r>
+        <w:rPr>
+          <w:rFonts w:ascii="Times New Roman" w:hAnsi="Times New Roman" w:cs="Times New Roman"/>
+          <w:noProof/>
+        </w:rPr>
+        <w:drawing>
+          <wp:inline distT="0" distB="0" distL="0" distR="0" wp14:anchorId="5FA20885" wp14:editId="0C7A425E">
+            <wp:extent cx="2072005" cy="2719268"/>
+            <wp:effectExtent l="0" t="0" r="4445" b="5080"/>
             <wp:docPr id="2032015158" name="Picture 1" descr="A close-up of a white paper&#10;&#10;AI-generated content may be incorrect."/>
             <wp:cNvGraphicFramePr>
               <a:graphicFrameLocks xmlns:a="http://schemas.openxmlformats.org/drawingml/2006/main" noChangeAspect="1"/>
@@ -28,7 +196,7 @@
                     <pic:cNvPr id="2032015158" name="Picture 1" descr="A close-up of a white paper&#10;&#10;AI-generated content may be incorrect."/>
                     <pic:cNvPicPr/>
                   </pic:nvPicPr>
-                  <pic:blipFill>
+                  <pic:blipFill rotWithShape="1">
                     <a:blip r:embed="rId5" cstate="print">
                       <a:extLst>
                         <a:ext uri="{28A0092B-C50C-407E-A947-70E740481C1C}">
@@ -36,18 +204,27 @@
                         </a:ext>
                       </a:extLst>
                     </a:blip>
+                    <a:srcRect l="65137" t="14660" b="50003"/>
                     <a:stretch>
                       <a:fillRect/>
                     </a:stretch>
                   </pic:blipFill>
-                  <pic:spPr>
+                  <pic:spPr bwMode="auto">
                     <a:xfrm>
                       <a:off x="0" y="0"/>
-                      <a:ext cx="5943600" cy="7695565"/>
+                      <a:ext cx="2072103" cy="2719397"/>
                     </a:xfrm>
                     <a:prstGeom prst="rect">
                       <a:avLst/>
                     </a:prstGeom>
+                    <a:ln>
+                      <a:noFill/>
+                    </a:ln>
+                    <a:extLst>
+                      <a:ext uri="{53640926-AAD7-44D8-BBD7-CCE9431645EC}">
+                        <a14:shadowObscured xmlns:a14="http://schemas.microsoft.com/office/drawing/2010/main"/>
+                      </a:ext>
+                    </a:extLst>
                   </pic:spPr>
                 </pic:pic>
               </a:graphicData>
@@ -79,68 +256,68 @@
         <w:rPr>
           <w:rFonts w:ascii="Times New Roman" w:hAnsi="Times New Roman" w:cs="Times New Roman"/>
         </w:rPr>
+        <w:t xml:space="preserve">Introduction: Describe the background and give a textual (not </w:t>
+      </w:r>
+      <w:proofErr w:type="gramStart"/>
+      <w:r>
+        <w:rPr>
+          <w:rFonts w:ascii="Times New Roman" w:hAnsi="Times New Roman" w:cs="Times New Roman"/>
+        </w:rPr>
+        <w:t>bulleted</w:t>
+      </w:r>
+      <w:proofErr w:type="gramEnd"/>
+      <w:r>
+        <w:rPr>
+          <w:rFonts w:ascii="Times New Roman" w:hAnsi="Times New Roman" w:cs="Times New Roman"/>
+        </w:rPr>
+        <w:t>) outline of the paper</w:t>
+      </w:r>
+    </w:p>
+    <w:p>
+      <w:pPr>
+        <w:rPr>
+          <w:rFonts w:ascii="Times New Roman" w:hAnsi="Times New Roman" w:cs="Times New Roman"/>
+        </w:rPr>
+      </w:pPr>
+      <w:r>
+        <w:rPr>
+          <w:rFonts w:ascii="Times New Roman" w:hAnsi="Times New Roman" w:cs="Times New Roman"/>
+        </w:rPr>
+        <w:t>One section per sorting algorithm, briefly describing how they work. For each algorithm, give the following:</w:t>
+      </w:r>
+    </w:p>
+    <w:p>
+      <w:pPr>
+        <w:rPr>
+          <w:rFonts w:ascii="Times New Roman" w:hAnsi="Times New Roman" w:cs="Times New Roman"/>
+        </w:rPr>
+      </w:pPr>
+      <w:proofErr w:type="gramStart"/>
+      <w:r>
+        <w:rPr>
+          <w:rFonts w:ascii="Times New Roman" w:hAnsi="Times New Roman" w:cs="Times New Roman"/>
+        </w:rPr>
+        <w:t>a textual</w:t>
+      </w:r>
+      <w:proofErr w:type="gramEnd"/>
+      <w:r>
+        <w:rPr>
+          <w:rFonts w:ascii="Times New Roman" w:hAnsi="Times New Roman" w:cs="Times New Roman"/>
+        </w:rPr>
+        <w:t xml:space="preserve"> description of how it works</w:t>
+      </w:r>
+    </w:p>
+    <w:p>
+      <w:pPr>
+        <w:rPr>
+          <w:rFonts w:ascii="Times New Roman" w:hAnsi="Times New Roman" w:cs="Times New Roman"/>
+        </w:rPr>
+      </w:pPr>
+      <w:r>
+        <w:rPr>
+          <w:rFonts w:ascii="Times New Roman" w:hAnsi="Times New Roman" w:cs="Times New Roman"/>
+        </w:rPr>
         <w:lastRenderedPageBreak/>
-        <w:t xml:space="preserve">Introduction: Describe the background and give a textual (not </w:t>
-      </w:r>
-      <w:proofErr w:type="gramStart"/>
-      <w:r>
-        <w:rPr>
-          <w:rFonts w:ascii="Times New Roman" w:hAnsi="Times New Roman" w:cs="Times New Roman"/>
-        </w:rPr>
-        <w:t>bulleted</w:t>
-      </w:r>
-      <w:proofErr w:type="gramEnd"/>
-      <w:r>
-        <w:rPr>
-          <w:rFonts w:ascii="Times New Roman" w:hAnsi="Times New Roman" w:cs="Times New Roman"/>
-        </w:rPr>
-        <w:t>) outline of the paper</w:t>
-      </w:r>
-    </w:p>
-    <w:p>
-      <w:pPr>
-        <w:rPr>
-          <w:rFonts w:ascii="Times New Roman" w:hAnsi="Times New Roman" w:cs="Times New Roman"/>
-        </w:rPr>
-      </w:pPr>
-      <w:r>
-        <w:rPr>
-          <w:rFonts w:ascii="Times New Roman" w:hAnsi="Times New Roman" w:cs="Times New Roman"/>
-        </w:rPr>
-        <w:t>One section per sorting algorithm, briefly describing how they work. For each algorithm, give the following:</w:t>
-      </w:r>
-    </w:p>
-    <w:p>
-      <w:pPr>
-        <w:rPr>
-          <w:rFonts w:ascii="Times New Roman" w:hAnsi="Times New Roman" w:cs="Times New Roman"/>
-        </w:rPr>
-      </w:pPr>
-      <w:proofErr w:type="gramStart"/>
-      <w:r>
-        <w:rPr>
-          <w:rFonts w:ascii="Times New Roman" w:hAnsi="Times New Roman" w:cs="Times New Roman"/>
-        </w:rPr>
-        <w:t>a textual</w:t>
-      </w:r>
-      <w:proofErr w:type="gramEnd"/>
-      <w:r>
-        <w:rPr>
-          <w:rFonts w:ascii="Times New Roman" w:hAnsi="Times New Roman" w:cs="Times New Roman"/>
-        </w:rPr>
-        <w:t xml:space="preserve"> description of how it works</w:t>
-      </w:r>
-    </w:p>
-    <w:p>
-      <w:pPr>
-        <w:rPr>
-          <w:rFonts w:ascii="Times New Roman" w:hAnsi="Times New Roman" w:cs="Times New Roman"/>
-        </w:rPr>
-      </w:pPr>
-      <w:r>
-        <w:rPr>
-          <w:rFonts w:ascii="Times New Roman" w:hAnsi="Times New Roman" w:cs="Times New Roman"/>
-        </w:rPr>
         <w:t>a visualization showing key components of the algorithm, operating on the initial array [8, 6, 7, 5, 3, 0, 9] — do not copy images from your sources; that is copyright infringement</w:t>
       </w:r>
     </w:p>
@@ -500,7 +677,6 @@
           <w:i/>
           <w:iCs/>
         </w:rPr>
-        <w:lastRenderedPageBreak/>
         <w:tab/>
       </w:r>
       <w:r>
@@ -607,6 +783,7 @@
           <w:b/>
           <w:bCs/>
         </w:rPr>
+        <w:lastRenderedPageBreak/>
         <w:t>Methodology</w:t>
       </w:r>
     </w:p>

</xml_diff>

<commit_message>
Writing a bit of the methodology and some more for the sorting  algorithms
</commit_message>
<xml_diff>
--- a/P2.docx
+++ b/P2.docx
@@ -11,12 +11,499 @@
       <w:r>
         <w:rPr>
           <w:rFonts w:ascii="Times New Roman" w:hAnsi="Times New Roman" w:cs="Times New Roman"/>
+        </w:rPr>
+        <w:t>Abstract: Approximately 100–200 words describing what the paper is about.</w:t>
+      </w:r>
+    </w:p>
+    <w:p>
+      <w:pPr>
+        <w:rPr>
+          <w:rFonts w:ascii="Times New Roman" w:hAnsi="Times New Roman" w:cs="Times New Roman"/>
+        </w:rPr>
+      </w:pPr>
+      <w:r>
+        <w:rPr>
+          <w:rFonts w:ascii="Times New Roman" w:hAnsi="Times New Roman" w:cs="Times New Roman"/>
+        </w:rPr>
+        <w:t>Introduction: Describe the background and give a textual (not bulleted) outline of the paper</w:t>
+      </w:r>
+    </w:p>
+    <w:p>
+      <w:pPr>
+        <w:rPr>
+          <w:rFonts w:ascii="Times New Roman" w:hAnsi="Times New Roman" w:cs="Times New Roman"/>
+        </w:rPr>
+      </w:pPr>
+      <w:r>
+        <w:rPr>
+          <w:rFonts w:ascii="Times New Roman" w:hAnsi="Times New Roman" w:cs="Times New Roman"/>
+        </w:rPr>
+        <w:t>One section per sorting algorithm, briefly describing how they work. For each algorithm, give the following:</w:t>
+      </w:r>
+    </w:p>
+    <w:p>
+      <w:pPr>
+        <w:rPr>
+          <w:rFonts w:ascii="Times New Roman" w:hAnsi="Times New Roman" w:cs="Times New Roman"/>
+        </w:rPr>
+      </w:pPr>
+      <w:r>
+        <w:rPr>
+          <w:rFonts w:ascii="Times New Roman" w:hAnsi="Times New Roman" w:cs="Times New Roman"/>
+        </w:rPr>
+        <w:t>a textual description of how it works</w:t>
+      </w:r>
+    </w:p>
+    <w:p>
+      <w:pPr>
+        <w:rPr>
+          <w:rFonts w:ascii="Times New Roman" w:hAnsi="Times New Roman" w:cs="Times New Roman"/>
+        </w:rPr>
+      </w:pPr>
+      <w:r>
+        <w:rPr>
+          <w:rFonts w:ascii="Times New Roman" w:hAnsi="Times New Roman" w:cs="Times New Roman"/>
+        </w:rPr>
+        <w:t>a visualization showing key components of the algorithm, operating on the initial array [8, 6, 7, 5, 3, 0, 9] — do not copy images from your sources; that is copyright infringement</w:t>
+      </w:r>
+    </w:p>
+    <w:p>
+      <w:pPr>
+        <w:rPr>
+          <w:rFonts w:ascii="Times New Roman" w:hAnsi="Times New Roman" w:cs="Times New Roman"/>
+        </w:rPr>
+      </w:pPr>
+      <w:r>
+        <w:rPr>
+          <w:rFonts w:ascii="Times New Roman" w:hAnsi="Times New Roman" w:cs="Times New Roman"/>
+        </w:rPr>
+        <w:t>Methodology: Devise and describe an experiment that will tell you which algorithm performs the best under some metric. That might be any of “time elapsed”, “memory used”, “comparisons made”, and so on.</w:t>
+      </w:r>
+    </w:p>
+    <w:p>
+      <w:pPr>
+        <w:rPr>
+          <w:rFonts w:ascii="Times New Roman" w:hAnsi="Times New Roman" w:cs="Times New Roman"/>
+        </w:rPr>
+      </w:pPr>
+      <w:r>
+        <w:rPr>
+          <w:rFonts w:ascii="Times New Roman" w:hAnsi="Times New Roman" w:cs="Times New Roman"/>
+        </w:rPr>
+        <w:t>Results: Run your experiment and report what you saw. This is probably the most freeform section, and may include tables, graphs, etc. Present your data in a way that tells a story.</w:t>
+      </w:r>
+    </w:p>
+    <w:p>
+      <w:pPr>
+        <w:rPr>
+          <w:rFonts w:ascii="Times New Roman" w:hAnsi="Times New Roman" w:cs="Times New Roman"/>
+        </w:rPr>
+      </w:pPr>
+      <w:r>
+        <w:rPr>
+          <w:rFonts w:ascii="Times New Roman" w:hAnsi="Times New Roman" w:cs="Times New Roman"/>
+        </w:rPr>
+        <w:t>Conclusions: Summarize the paper and provide a launching point for further discussion.</w:t>
+      </w:r>
+    </w:p>
+    <w:p>
+      <w:pPr>
+        <w:rPr>
+          <w:rFonts w:ascii="Times New Roman" w:hAnsi="Times New Roman" w:cs="Times New Roman"/>
+        </w:rPr>
+      </w:pPr>
+      <w:r>
+        <w:rPr>
+          <w:rFonts w:ascii="Times New Roman" w:hAnsi="Times New Roman" w:cs="Times New Roman"/>
+        </w:rPr>
+        <w:t>References: List works that you cite in-text here.</w:t>
+      </w:r>
+    </w:p>
+    <w:p>
+      <w:pPr>
+        <w:rPr>
+          <w:rFonts w:ascii="Times New Roman" w:hAnsi="Times New Roman" w:cs="Times New Roman"/>
+        </w:rPr>
+      </w:pPr>
+      <w:r>
+        <w:rPr>
+          <w:rFonts w:ascii="Times New Roman" w:hAnsi="Times New Roman" w:cs="Times New Roman"/>
+        </w:rPr>
+        <w:t>Do not list anything that you do not cite in-text.</w:t>
+      </w:r>
+    </w:p>
+    <w:p>
+      <w:pPr>
+        <w:rPr>
+          <w:rFonts w:ascii="Times New Roman" w:hAnsi="Times New Roman" w:cs="Times New Roman"/>
+        </w:rPr>
+      </w:pPr>
+      <w:r>
+        <w:rPr>
+          <w:rFonts w:ascii="Times New Roman" w:hAnsi="Times New Roman" w:cs="Times New Roman"/>
+        </w:rPr>
+        <w:t>Any time that you are using ideas or words from another source, you absolutely have to cite that source in-text, like “On average, a binary search tree with n keys generated from a random series of insertions and removals of keys has expected height O(</w:t>
+      </w:r>
+      <w:proofErr w:type="spellStart"/>
+      <w:r>
+        <w:rPr>
+          <w:rFonts w:ascii="Times New Roman" w:hAnsi="Times New Roman" w:cs="Times New Roman"/>
+        </w:rPr>
+        <w:t>logn</w:t>
+      </w:r>
+      <w:proofErr w:type="spellEnd"/>
+      <w:r>
+        <w:rPr>
+          <w:rFonts w:ascii="Times New Roman" w:hAnsi="Times New Roman" w:cs="Times New Roman"/>
+        </w:rPr>
+        <w:t>) (Goodrich et al., 2014, p.470).”</w:t>
+      </w:r>
+    </w:p>
+    <w:p>
+      <w:pPr>
+        <w:rPr>
+          <w:rFonts w:ascii="Times New Roman" w:hAnsi="Times New Roman" w:cs="Times New Roman"/>
+        </w:rPr>
+      </w:pPr>
+      <w:r>
+        <w:rPr>
+          <w:rFonts w:ascii="Times New Roman" w:hAnsi="Times New Roman" w:cs="Times New Roman"/>
+        </w:rPr>
+        <w:t>Appendix: Include the entire source code of your implementation typeset into the document.</w:t>
+      </w:r>
+    </w:p>
+    <w:p>
+      <w:pPr>
+        <w:rPr>
+          <w:rFonts w:ascii="Times New Roman" w:hAnsi="Times New Roman" w:cs="Times New Roman"/>
+        </w:rPr>
+      </w:pPr>
+      <w:r>
+        <w:rPr>
+          <w:rFonts w:ascii="Times New Roman" w:hAnsi="Times New Roman" w:cs="Times New Roman"/>
+        </w:rPr>
+        <w:t>Log: Include a transcript of your git log.</w:t>
+      </w:r>
+    </w:p>
+    <w:p>
+      <w:pPr>
+        <w:rPr>
+          <w:rFonts w:ascii="Times New Roman" w:hAnsi="Times New Roman" w:cs="Times New Roman"/>
+          <w:b/>
+          <w:bCs/>
+        </w:rPr>
+      </w:pPr>
+      <w:r>
+        <w:rPr>
+          <w:rFonts w:ascii="Times New Roman" w:hAnsi="Times New Roman" w:cs="Times New Roman"/>
+          <w:b/>
+          <w:bCs/>
+        </w:rPr>
+        <w:t>Abstract</w:t>
+      </w:r>
+    </w:p>
+    <w:p>
+      <w:pPr>
+        <w:rPr>
+          <w:rFonts w:ascii="Times New Roman" w:hAnsi="Times New Roman" w:cs="Times New Roman"/>
+        </w:rPr>
+      </w:pPr>
+    </w:p>
+    <w:p>
+      <w:pPr>
+        <w:rPr>
+          <w:rFonts w:ascii="Times New Roman" w:hAnsi="Times New Roman" w:cs="Times New Roman"/>
+          <w:b/>
+          <w:bCs/>
+        </w:rPr>
+      </w:pPr>
+      <w:r>
+        <w:rPr>
+          <w:rFonts w:ascii="Times New Roman" w:hAnsi="Times New Roman" w:cs="Times New Roman"/>
+          <w:b/>
+          <w:bCs/>
+        </w:rPr>
+        <w:t>Introduction</w:t>
+      </w:r>
+    </w:p>
+    <w:p>
+      <w:pPr>
+        <w:rPr>
+          <w:rFonts w:ascii="Times New Roman" w:hAnsi="Times New Roman" w:cs="Times New Roman"/>
+        </w:rPr>
+      </w:pPr>
+    </w:p>
+    <w:p>
+      <w:pPr>
+        <w:rPr>
+          <w:rFonts w:ascii="Times New Roman" w:hAnsi="Times New Roman" w:cs="Times New Roman"/>
+          <w:b/>
+          <w:bCs/>
+          <w:i/>
+          <w:iCs/>
+        </w:rPr>
+      </w:pPr>
+      <w:r>
+        <w:rPr>
+          <w:rFonts w:ascii="Times New Roman" w:hAnsi="Times New Roman" w:cs="Times New Roman"/>
+          <w:b/>
+          <w:bCs/>
+          <w:i/>
+          <w:iCs/>
+        </w:rPr>
+        <w:t>Heapsort</w:t>
+      </w:r>
+    </w:p>
+    <w:p>
+      <w:pPr>
+        <w:rPr>
+          <w:rFonts w:ascii="Times New Roman" w:hAnsi="Times New Roman" w:cs="Times New Roman"/>
+        </w:rPr>
+      </w:pPr>
+      <w:r>
+        <w:rPr>
+          <w:rFonts w:ascii="Times New Roman" w:hAnsi="Times New Roman" w:cs="Times New Roman"/>
+          <w:b/>
+          <w:bCs/>
+          <w:i/>
+          <w:iCs/>
+        </w:rPr>
+        <w:tab/>
+      </w:r>
+      <w:r>
+        <w:rPr>
+          <w:rFonts w:ascii="Times New Roman" w:hAnsi="Times New Roman" w:cs="Times New Roman"/>
+        </w:rPr>
+        <w:t xml:space="preserve">Invented by J. W. J. Williams in 1964, this sorting algorithm organizes an array of elements into a max heap, and then repeatedly moves the max element of the heap, placing it at the end of the array (Wikipedia, </w:t>
+      </w:r>
+      <w:r>
+        <w:rPr>
+          <w:rFonts w:ascii="Times New Roman" w:hAnsi="Times New Roman" w:cs="Times New Roman"/>
+        </w:rPr>
+        <w:t>2025</w:t>
+      </w:r>
+      <w:r>
+        <w:rPr>
+          <w:rFonts w:ascii="Times New Roman" w:hAnsi="Times New Roman" w:cs="Times New Roman"/>
+        </w:rPr>
+        <w:t>a</w:t>
+      </w:r>
+      <w:r>
+        <w:rPr>
+          <w:rFonts w:ascii="Times New Roman" w:hAnsi="Times New Roman" w:cs="Times New Roman"/>
+        </w:rPr>
+        <w:t>)</w:t>
+      </w:r>
+      <w:r>
+        <w:rPr>
+          <w:rFonts w:ascii="Times New Roman" w:hAnsi="Times New Roman" w:cs="Times New Roman"/>
+        </w:rPr>
+        <w:t>. This process continues until th</w:t>
+      </w:r>
+      <w:r>
+        <w:rPr>
+          <w:rFonts w:ascii="Times New Roman" w:hAnsi="Times New Roman" w:cs="Times New Roman"/>
+        </w:rPr>
+        <w:t>e max heap has only one element left</w:t>
+      </w:r>
+      <w:r>
+        <w:rPr>
+          <w:rFonts w:ascii="Times New Roman" w:hAnsi="Times New Roman" w:cs="Times New Roman"/>
+        </w:rPr>
+        <w:t>. Because it is a binary heap, this sorting algorithm has an efficient time complexity of O(</w:t>
+      </w:r>
+      <w:r>
+        <w:rPr>
+          <w:rFonts w:ascii="Times New Roman" w:hAnsi="Times New Roman" w:cs="Times New Roman"/>
+          <w:i/>
+          <w:iCs/>
+        </w:rPr>
+        <w:t>n</w:t>
+      </w:r>
+      <w:r>
+        <w:rPr>
+          <w:rFonts w:ascii="Times New Roman" w:hAnsi="Times New Roman" w:cs="Times New Roman"/>
+          <w:i/>
+          <w:iCs/>
+        </w:rPr>
+        <w:t xml:space="preserve"> </w:t>
+      </w:r>
+      <w:r>
+        <w:rPr>
+          <w:rFonts w:ascii="Times New Roman" w:hAnsi="Times New Roman" w:cs="Times New Roman"/>
+          <w:i/>
+          <w:iCs/>
+        </w:rPr>
+        <w:t>log</w:t>
+      </w:r>
+      <w:r>
+        <w:rPr>
+          <w:rFonts w:ascii="Times New Roman" w:hAnsi="Times New Roman" w:cs="Times New Roman"/>
+          <w:i/>
+          <w:iCs/>
+        </w:rPr>
+        <w:t xml:space="preserve"> </w:t>
+      </w:r>
+      <w:r>
+        <w:rPr>
+          <w:rFonts w:ascii="Times New Roman" w:hAnsi="Times New Roman" w:cs="Times New Roman"/>
+          <w:i/>
+          <w:iCs/>
+        </w:rPr>
+        <w:t>n</w:t>
+      </w:r>
+      <w:r>
+        <w:rPr>
+          <w:rFonts w:ascii="Times New Roman" w:hAnsi="Times New Roman" w:cs="Times New Roman"/>
+        </w:rPr>
+        <w:t>)</w:t>
+      </w:r>
+      <w:r>
+        <w:rPr>
+          <w:rFonts w:ascii="Times New Roman" w:hAnsi="Times New Roman" w:cs="Times New Roman"/>
+        </w:rPr>
+        <w:t xml:space="preserve"> which makes it good for large data sets, and it also does not need much more auxiliary space </w:t>
+      </w:r>
+      <w:r>
+        <w:rPr>
+          <w:rFonts w:ascii="Times New Roman" w:hAnsi="Times New Roman" w:cs="Times New Roman"/>
+        </w:rPr>
+        <w:t>(</w:t>
+      </w:r>
+      <w:proofErr w:type="spellStart"/>
+      <w:r>
+        <w:rPr>
+          <w:rFonts w:ascii="Times New Roman" w:hAnsi="Times New Roman" w:cs="Times New Roman"/>
+        </w:rPr>
+        <w:t>GeeksforGeeks</w:t>
+      </w:r>
+      <w:proofErr w:type="spellEnd"/>
+      <w:r>
+        <w:rPr>
+          <w:rFonts w:ascii="Times New Roman" w:hAnsi="Times New Roman" w:cs="Times New Roman"/>
+        </w:rPr>
+        <w:t>, 2025)</w:t>
+      </w:r>
+      <w:r>
+        <w:rPr>
+          <w:rFonts w:ascii="Times New Roman" w:hAnsi="Times New Roman" w:cs="Times New Roman"/>
+        </w:rPr>
+        <w:t xml:space="preserve">. </w:t>
+      </w:r>
+    </w:p>
+    <w:p>
+      <w:pPr>
+        <w:rPr>
+          <w:rFonts w:ascii="Times New Roman" w:hAnsi="Times New Roman" w:cs="Times New Roman"/>
+        </w:rPr>
+      </w:pPr>
+      <w:r>
+        <w:rPr>
+          <w:rFonts w:ascii="Times New Roman" w:hAnsi="Times New Roman" w:cs="Times New Roman"/>
+        </w:rPr>
+        <w:lastRenderedPageBreak/>
+        <w:tab/>
+      </w:r>
+      <w:r>
+        <w:rPr>
+          <w:rFonts w:ascii="Times New Roman" w:hAnsi="Times New Roman" w:cs="Times New Roman"/>
+        </w:rPr>
+        <w:t xml:space="preserve">This process is visually represented in </w:t>
+      </w:r>
+      <w:r>
+        <w:rPr>
+          <w:rFonts w:ascii="Times New Roman" w:hAnsi="Times New Roman" w:cs="Times New Roman"/>
+          <w:i/>
+          <w:iCs/>
+        </w:rPr>
+        <w:t>Fig. 1</w:t>
+      </w:r>
+      <w:r>
+        <w:rPr>
+          <w:rFonts w:ascii="Times New Roman" w:hAnsi="Times New Roman" w:cs="Times New Roman"/>
+        </w:rPr>
+        <w:t xml:space="preserve">. Starting from the initial array of integers </w:t>
+      </w:r>
+      <w:r>
+        <w:rPr>
+          <w:rFonts w:ascii="Times New Roman" w:hAnsi="Times New Roman" w:cs="Times New Roman"/>
+        </w:rPr>
+        <w:t>[</w:t>
+      </w:r>
+      <w:r>
+        <w:rPr>
+          <w:rFonts w:ascii="Times New Roman" w:hAnsi="Times New Roman" w:cs="Times New Roman"/>
+        </w:rPr>
+        <w:t>8, 6, 7, 5, 3, 0, 9</w:t>
+      </w:r>
+      <w:r>
+        <w:rPr>
+          <w:rFonts w:ascii="Times New Roman" w:hAnsi="Times New Roman" w:cs="Times New Roman"/>
+        </w:rPr>
+        <w:t>]</w:t>
+      </w:r>
+      <w:r>
+        <w:rPr>
+          <w:rFonts w:ascii="Times New Roman" w:hAnsi="Times New Roman" w:cs="Times New Roman"/>
+        </w:rPr>
+        <w:t xml:space="preserve">, we build a binary heap from that. Then, we convert it into a max heap, where the maximum value is the root and both its children are smaller. Then the largest element swaps with the last child and then the largest element is dequeued to the last index of the array. Afterwards we apply the </w:t>
+      </w:r>
+      <w:proofErr w:type="spellStart"/>
+      <w:r>
+        <w:rPr>
+          <w:rFonts w:ascii="Times New Roman" w:hAnsi="Times New Roman" w:cs="Times New Roman"/>
+          <w:i/>
+          <w:iCs/>
+        </w:rPr>
+        <w:t>bubbleDown</w:t>
+      </w:r>
+      <w:proofErr w:type="spellEnd"/>
+      <w:r>
+        <w:rPr>
+          <w:rFonts w:ascii="Times New Roman" w:hAnsi="Times New Roman" w:cs="Times New Roman"/>
+        </w:rPr>
+        <w:t xml:space="preserve"> method to recreate the max heap and repeat the whole process until we get the sorted array </w:t>
+      </w:r>
+      <w:r>
+        <w:rPr>
+          <w:rFonts w:ascii="Times New Roman" w:hAnsi="Times New Roman" w:cs="Times New Roman"/>
+        </w:rPr>
+        <w:t>[</w:t>
+      </w:r>
+      <w:r>
+        <w:rPr>
+          <w:rFonts w:ascii="Times New Roman" w:hAnsi="Times New Roman" w:cs="Times New Roman"/>
+        </w:rPr>
+        <w:t>0, 3, 5, 6, 7, 8, 9</w:t>
+      </w:r>
+      <w:r>
+        <w:rPr>
+          <w:rFonts w:ascii="Times New Roman" w:hAnsi="Times New Roman" w:cs="Times New Roman"/>
+        </w:rPr>
+        <w:t>]</w:t>
+      </w:r>
+      <w:r>
+        <w:rPr>
+          <w:rFonts w:ascii="Times New Roman" w:hAnsi="Times New Roman" w:cs="Times New Roman"/>
+        </w:rPr>
+        <w:t xml:space="preserve">. </w:t>
+      </w:r>
+    </w:p>
+    <w:p>
+      <w:pPr>
+        <w:rPr>
+          <w:rFonts w:ascii="Times New Roman" w:hAnsi="Times New Roman" w:cs="Times New Roman"/>
+        </w:rPr>
+      </w:pPr>
+      <w:r>
+        <w:rPr>
+          <w:rFonts w:ascii="Times New Roman" w:hAnsi="Times New Roman" w:cs="Times New Roman"/>
           <w:noProof/>
         </w:rPr>
         <w:drawing>
-          <wp:inline distT="0" distB="0" distL="0" distR="0" wp14:anchorId="69D32377" wp14:editId="5E8A2173">
-            <wp:extent cx="2400300" cy="3799840"/>
-            <wp:effectExtent l="0" t="0" r="0" b="0"/>
+          <wp:inline distT="0" distB="0" distL="0" distR="0" wp14:anchorId="323C07AB" wp14:editId="71373EFA">
+            <wp:extent cx="2314575" cy="3799840"/>
+            <wp:effectExtent l="0" t="0" r="9525" b="0"/>
             <wp:docPr id="1614583903" name="Picture 1" descr="A close-up of a white paper&#10;&#10;AI-generated content may be incorrect."/>
             <wp:cNvGraphicFramePr>
               <a:graphicFrameLocks xmlns:a="http://schemas.openxmlformats.org/drawingml/2006/main" noChangeAspect="1"/>
@@ -36,15 +523,15 @@
                         </a:ext>
                       </a:extLst>
                     </a:blip>
-                    <a:srcRect l="59615" t="50623"/>
+                    <a:srcRect l="59615" t="50623" r="1442"/>
                     <a:stretch>
                       <a:fillRect/>
                     </a:stretch>
                   </pic:blipFill>
                   <pic:spPr bwMode="auto">
-                    <a:xfrm>
+                    <a:xfrm rot="10800000">
                       <a:off x="0" y="0"/>
-                      <a:ext cx="2400300" cy="3799840"/>
+                      <a:ext cx="2314575" cy="3799840"/>
                     </a:xfrm>
                     <a:prstGeom prst="rect">
                       <a:avLst/>
@@ -67,66 +554,153 @@
       <w:r>
         <w:rPr>
           <w:rFonts w:ascii="Times New Roman" w:hAnsi="Times New Roman" w:cs="Times New Roman"/>
+        </w:rPr>
+        <w:tab/>
+      </w:r>
+    </w:p>
+    <w:p>
+      <w:pPr>
+        <w:rPr>
+          <w:rFonts w:ascii="Times New Roman" w:hAnsi="Times New Roman" w:cs="Times New Roman"/>
+          <w:b/>
+          <w:bCs/>
+          <w:i/>
+          <w:iCs/>
+        </w:rPr>
+      </w:pPr>
+      <w:r>
+        <w:rPr>
+          <w:rFonts w:ascii="Times New Roman" w:hAnsi="Times New Roman" w:cs="Times New Roman"/>
+          <w:b/>
+          <w:bCs/>
+          <w:i/>
+          <w:iCs/>
+        </w:rPr>
+        <w:t>Quicksort</w:t>
+      </w:r>
+    </w:p>
+    <w:p>
+      <w:pPr>
+        <w:rPr>
+          <w:rFonts w:ascii="Times New Roman" w:hAnsi="Times New Roman" w:cs="Times New Roman"/>
+        </w:rPr>
+      </w:pPr>
+      <w:r>
+        <w:rPr>
+          <w:rFonts w:ascii="Times New Roman" w:hAnsi="Times New Roman" w:cs="Times New Roman"/>
+          <w:b/>
+          <w:bCs/>
+          <w:i/>
+          <w:iCs/>
+        </w:rPr>
+        <w:tab/>
+      </w:r>
+      <w:r>
+        <w:rPr>
+          <w:rFonts w:ascii="Times New Roman" w:hAnsi="Times New Roman" w:cs="Times New Roman"/>
+        </w:rPr>
+        <w:t xml:space="preserve">Developed in 1959 by Tony Hoare and published in 1961 (Wikipedia, 2025b). </w:t>
+      </w:r>
+      <w:r>
+        <w:rPr>
+          <w:rFonts w:ascii="Times New Roman" w:hAnsi="Times New Roman" w:cs="Times New Roman"/>
+        </w:rPr>
+        <w:t xml:space="preserve">It is one of the divide-and-conquer algorithms, where they take a problem and divide it into tinier subproblems, recursively solves them and then combines the solutions </w:t>
+      </w:r>
+      <w:r>
+        <w:rPr>
+          <w:rFonts w:ascii="Times New Roman" w:hAnsi="Times New Roman" w:cs="Times New Roman"/>
+        </w:rPr>
+        <w:t>(Khan Academy, 2025)</w:t>
+      </w:r>
+      <w:r>
+        <w:rPr>
+          <w:rFonts w:ascii="Times New Roman" w:hAnsi="Times New Roman" w:cs="Times New Roman"/>
+        </w:rPr>
+        <w:t xml:space="preserve">. </w:t>
+      </w:r>
+      <w:r>
+        <w:rPr>
+          <w:rFonts w:ascii="Times New Roman" w:hAnsi="Times New Roman" w:cs="Times New Roman"/>
+        </w:rPr>
+        <w:t xml:space="preserve">However, it does have a time complexity of </w:t>
+      </w:r>
+      <w:r>
+        <w:rPr>
+          <w:rFonts w:ascii="Times New Roman" w:hAnsi="Times New Roman" w:cs="Times New Roman"/>
+        </w:rPr>
+        <w:t>Θ</w:t>
+      </w:r>
+      <w:r>
+        <w:rPr>
+          <w:rFonts w:ascii="Times New Roman" w:hAnsi="Times New Roman" w:cs="Times New Roman"/>
+        </w:rPr>
+        <w:t>(</w:t>
+      </w:r>
+      <w:r>
+        <w:rPr>
+          <w:rFonts w:ascii="Times New Roman" w:hAnsi="Times New Roman" w:cs="Times New Roman"/>
+          <w:i/>
+          <w:iCs/>
+        </w:rPr>
+        <w:t>n</w:t>
+      </w:r>
+      <w:r>
+        <w:rPr>
+          <w:rFonts w:ascii="Times New Roman" w:hAnsi="Times New Roman" w:cs="Times New Roman"/>
+          <w:i/>
+          <w:iCs/>
+          <w:vertAlign w:val="superscript"/>
+        </w:rPr>
+        <w:t>2</w:t>
+      </w:r>
+      <w:r>
+        <w:rPr>
+          <w:rFonts w:ascii="Times New Roman" w:hAnsi="Times New Roman" w:cs="Times New Roman"/>
+        </w:rPr>
+        <w:t xml:space="preserve">). </w:t>
+      </w:r>
+      <w:r>
+        <w:rPr>
+          <w:rFonts w:ascii="Times New Roman" w:hAnsi="Times New Roman" w:cs="Times New Roman"/>
+        </w:rPr>
+        <w:t xml:space="preserve">This can be exemplified on </w:t>
+      </w:r>
+      <w:r>
+        <w:rPr>
+          <w:rFonts w:ascii="Times New Roman" w:hAnsi="Times New Roman" w:cs="Times New Roman"/>
+          <w:i/>
+          <w:iCs/>
+        </w:rPr>
+        <w:t>Fig. 2</w:t>
+      </w:r>
+      <w:r>
+        <w:rPr>
+          <w:rFonts w:ascii="Times New Roman" w:hAnsi="Times New Roman" w:cs="Times New Roman"/>
+        </w:rPr>
+        <w:t xml:space="preserve">. Using the same array as previous examples, we first pick the first element as the pivot. In the code, there are two pointers, the start which is after the pivot, and the end that is at the end of the array. The start pointer moves forward until it sees an element that is larger than the pivot and the end moves backwards until it sees an element that is smaller than the pivot. When this happens the start and end pointers swap values. Ultimately, the pointers will cross each other, and here we swap with the pivot, so all elements smaller or equal than the pivot are to the left and all the larger ones are to the right. </w:t>
+      </w:r>
+      <w:r>
+        <w:rPr>
+          <w:rFonts w:ascii="Times New Roman" w:hAnsi="Times New Roman" w:cs="Times New Roman"/>
+        </w:rPr>
+        <w:t xml:space="preserve">We repeat the process with the left and right parts, choosing a pivot and arranging the elements, until we have a subarray with less than two elements, which would mean that our array is sorted. </w:t>
+      </w:r>
+    </w:p>
+    <w:p>
+      <w:pPr>
+        <w:rPr>
+          <w:rFonts w:ascii="Times New Roman" w:hAnsi="Times New Roman" w:cs="Times New Roman"/>
+        </w:rPr>
+      </w:pPr>
+      <w:r>
+        <w:rPr>
+          <w:rFonts w:ascii="Times New Roman" w:hAnsi="Times New Roman" w:cs="Times New Roman"/>
           <w:noProof/>
         </w:rPr>
+        <w:lastRenderedPageBreak/>
         <w:drawing>
-          <wp:inline distT="0" distB="0" distL="0" distR="0" wp14:anchorId="78E4D3F6" wp14:editId="1BF8ECB2">
-            <wp:extent cx="2921000" cy="3538332"/>
-            <wp:effectExtent l="0" t="0" r="0" b="5080"/>
-            <wp:docPr id="1198555381" name="Picture 1" descr="A close-up of a white paper&#10;&#10;AI-generated content may be incorrect."/>
-            <wp:cNvGraphicFramePr>
-              <a:graphicFrameLocks xmlns:a="http://schemas.openxmlformats.org/drawingml/2006/main" noChangeAspect="1"/>
-            </wp:cNvGraphicFramePr>
-            <a:graphic xmlns:a="http://schemas.openxmlformats.org/drawingml/2006/main">
-              <a:graphicData uri="http://schemas.openxmlformats.org/drawingml/2006/picture">
-                <pic:pic xmlns:pic="http://schemas.openxmlformats.org/drawingml/2006/picture">
-                  <pic:nvPicPr>
-                    <pic:cNvPr id="2032015158" name="Picture 1" descr="A close-up of a white paper&#10;&#10;AI-generated content may be incorrect."/>
-                    <pic:cNvPicPr/>
-                  </pic:nvPicPr>
-                  <pic:blipFill rotWithShape="1">
-                    <a:blip r:embed="rId5" cstate="print">
-                      <a:extLst>
-                        <a:ext uri="{28A0092B-C50C-407E-A947-70E740481C1C}">
-                          <a14:useLocalDpi xmlns:a14="http://schemas.microsoft.com/office/drawing/2010/main" val="0"/>
-                        </a:ext>
-                      </a:extLst>
-                    </a:blip>
-                    <a:srcRect t="54016" r="50849"/>
-                    <a:stretch>
-                      <a:fillRect/>
-                    </a:stretch>
-                  </pic:blipFill>
-                  <pic:spPr bwMode="auto">
-                    <a:xfrm>
-                      <a:off x="0" y="0"/>
-                      <a:ext cx="2921330" cy="3538732"/>
-                    </a:xfrm>
-                    <a:prstGeom prst="rect">
-                      <a:avLst/>
-                    </a:prstGeom>
-                    <a:ln>
-                      <a:noFill/>
-                    </a:ln>
-                    <a:extLst>
-                      <a:ext uri="{53640926-AAD7-44D8-BBD7-CCE9431645EC}">
-                        <a14:shadowObscured xmlns:a14="http://schemas.microsoft.com/office/drawing/2010/main"/>
-                      </a:ext>
-                    </a:extLst>
-                  </pic:spPr>
-                </pic:pic>
-              </a:graphicData>
-            </a:graphic>
-          </wp:inline>
-        </w:drawing>
-      </w:r>
-      <w:r>
-        <w:rPr>
-          <w:rFonts w:ascii="Times New Roman" w:hAnsi="Times New Roman" w:cs="Times New Roman"/>
-          <w:noProof/>
-        </w:rPr>
-        <w:drawing>
-          <wp:inline distT="0" distB="0" distL="0" distR="0" wp14:anchorId="47899422" wp14:editId="714D8763">
+          <wp:inline distT="0" distB="0" distL="0" distR="0" wp14:anchorId="15234643" wp14:editId="547DBC34">
             <wp:extent cx="3764280" cy="1851831"/>
             <wp:effectExtent l="0" t="0" r="7620" b="0"/>
             <wp:docPr id="1151744676" name="Picture 1" descr="A close-up of a white paper&#10;&#10;AI-generated content may be incorrect."/>
@@ -154,7 +728,7 @@
                     </a:stretch>
                   </pic:blipFill>
                   <pic:spPr bwMode="auto">
-                    <a:xfrm>
+                    <a:xfrm rot="10800000">
                       <a:off x="0" y="0"/>
                       <a:ext cx="3764990" cy="1852180"/>
                     </a:xfrm>
@@ -176,15 +750,210 @@
           </wp:inline>
         </w:drawing>
       </w:r>
+    </w:p>
+    <w:p>
+      <w:pPr>
+        <w:rPr>
+          <w:rFonts w:ascii="Times New Roman" w:hAnsi="Times New Roman" w:cs="Times New Roman"/>
+          <w:b/>
+          <w:bCs/>
+          <w:i/>
+          <w:iCs/>
+        </w:rPr>
+      </w:pPr>
+      <w:r>
+        <w:rPr>
+          <w:rFonts w:ascii="Times New Roman" w:hAnsi="Times New Roman" w:cs="Times New Roman"/>
+          <w:b/>
+          <w:bCs/>
+          <w:i/>
+          <w:iCs/>
+        </w:rPr>
+        <w:t>Merge sort</w:t>
+      </w:r>
+    </w:p>
+    <w:p>
+      <w:pPr>
+        <w:rPr>
+          <w:rFonts w:ascii="Times New Roman" w:hAnsi="Times New Roman" w:cs="Times New Roman"/>
+        </w:rPr>
+      </w:pPr>
+      <w:r>
+        <w:rPr>
+          <w:rFonts w:ascii="Times New Roman" w:hAnsi="Times New Roman" w:cs="Times New Roman"/>
+        </w:rPr>
+        <w:tab/>
+      </w:r>
+      <w:r>
+        <w:rPr>
+          <w:rFonts w:ascii="Times New Roman" w:hAnsi="Times New Roman" w:cs="Times New Roman"/>
+        </w:rPr>
+        <w:t xml:space="preserve">It was developed by John von Neumann in 1945, merge sort is another of the divide-and-conquer type of sorting algorithms </w:t>
+      </w:r>
+      <w:r>
+        <w:rPr>
+          <w:rFonts w:ascii="Times New Roman" w:hAnsi="Times New Roman" w:cs="Times New Roman"/>
+        </w:rPr>
+        <w:t>(Alake, 2023)</w:t>
+      </w:r>
+      <w:r>
+        <w:rPr>
+          <w:rFonts w:ascii="Times New Roman" w:hAnsi="Times New Roman" w:cs="Times New Roman"/>
+        </w:rPr>
+        <w:t xml:space="preserve">. It works by recursively splitting the array in halves until we have subarrays of less than two elements and then merges these subarrays together making sure that they are sorted </w:t>
+      </w:r>
+      <w:r>
+        <w:rPr>
+          <w:rFonts w:ascii="Times New Roman" w:hAnsi="Times New Roman" w:cs="Times New Roman"/>
+        </w:rPr>
+        <w:t>(Alake, 2023)</w:t>
+      </w:r>
+      <w:r>
+        <w:rPr>
+          <w:rFonts w:ascii="Times New Roman" w:hAnsi="Times New Roman" w:cs="Times New Roman"/>
+        </w:rPr>
+        <w:t>.</w:t>
+      </w:r>
+      <w:r>
+        <w:rPr>
+          <w:rFonts w:ascii="Times New Roman" w:hAnsi="Times New Roman" w:cs="Times New Roman"/>
+        </w:rPr>
+        <w:t xml:space="preserve"> It has a time complexity of </w:t>
+      </w:r>
+      <w:r>
+        <w:rPr>
+          <w:rFonts w:ascii="Times New Roman" w:hAnsi="Times New Roman" w:cs="Times New Roman"/>
+        </w:rPr>
+        <w:t>Θ</w:t>
+      </w:r>
+      <w:r>
+        <w:rPr>
+          <w:rFonts w:ascii="Times New Roman" w:hAnsi="Times New Roman" w:cs="Times New Roman"/>
+        </w:rPr>
+        <w:t>(</w:t>
+      </w:r>
+      <w:r>
+        <w:rPr>
+          <w:rFonts w:ascii="Times New Roman" w:hAnsi="Times New Roman" w:cs="Times New Roman"/>
+          <w:i/>
+          <w:iCs/>
+        </w:rPr>
+        <w:t>n</w:t>
+      </w:r>
+      <w:r>
+        <w:rPr>
+          <w:rFonts w:ascii="Times New Roman" w:hAnsi="Times New Roman" w:cs="Times New Roman"/>
+        </w:rPr>
+        <w:t xml:space="preserve"> </w:t>
+      </w:r>
+      <w:r>
+        <w:rPr>
+          <w:rFonts w:ascii="Times New Roman" w:hAnsi="Times New Roman" w:cs="Times New Roman"/>
+          <w:i/>
+          <w:iCs/>
+        </w:rPr>
+        <w:t>log</w:t>
+      </w:r>
+      <w:r>
+        <w:rPr>
+          <w:rFonts w:ascii="Times New Roman" w:hAnsi="Times New Roman" w:cs="Times New Roman"/>
+        </w:rPr>
+        <w:t xml:space="preserve"> </w:t>
+      </w:r>
+      <w:r>
+        <w:rPr>
+          <w:rFonts w:ascii="Times New Roman" w:hAnsi="Times New Roman" w:cs="Times New Roman"/>
+          <w:i/>
+          <w:iCs/>
+        </w:rPr>
+        <w:t>n</w:t>
+      </w:r>
+      <w:r>
+        <w:rPr>
+          <w:rFonts w:ascii="Times New Roman" w:hAnsi="Times New Roman" w:cs="Times New Roman"/>
+        </w:rPr>
+        <w:t>).</w:t>
+      </w:r>
+      <w:r>
+        <w:rPr>
+          <w:rFonts w:ascii="Times New Roman" w:hAnsi="Times New Roman" w:cs="Times New Roman"/>
+        </w:rPr>
+        <w:t xml:space="preserve"> </w:t>
+      </w:r>
+    </w:p>
+    <w:p>
+      <w:pPr>
+        <w:rPr>
+          <w:rFonts w:ascii="Times New Roman" w:hAnsi="Times New Roman" w:cs="Times New Roman"/>
+        </w:rPr>
+      </w:pPr>
+      <w:r>
+        <w:rPr>
+          <w:rFonts w:ascii="Times New Roman" w:hAnsi="Times New Roman" w:cs="Times New Roman"/>
+        </w:rPr>
+        <w:t xml:space="preserve"> </w:t>
+      </w:r>
+      <w:r>
+        <w:rPr>
+          <w:rFonts w:ascii="Times New Roman" w:hAnsi="Times New Roman" w:cs="Times New Roman"/>
+        </w:rPr>
+        <w:tab/>
+        <w:t xml:space="preserve">In </w:t>
+      </w:r>
+      <w:r>
+        <w:rPr>
+          <w:rFonts w:ascii="Times New Roman" w:hAnsi="Times New Roman" w:cs="Times New Roman"/>
+          <w:i/>
+          <w:iCs/>
+        </w:rPr>
+        <w:t>Fig. 3</w:t>
+      </w:r>
+      <w:r>
+        <w:rPr>
+          <w:rFonts w:ascii="Times New Roman" w:hAnsi="Times New Roman" w:cs="Times New Roman"/>
+          <w:i/>
+          <w:iCs/>
+        </w:rPr>
+        <w:t xml:space="preserve"> </w:t>
+      </w:r>
+      <w:r>
+        <w:rPr>
+          <w:rFonts w:ascii="Times New Roman" w:hAnsi="Times New Roman" w:cs="Times New Roman"/>
+        </w:rPr>
+        <w:t xml:space="preserve">there is a visual representation of the merge sort algorithm. We are using the same array as before. </w:t>
+      </w:r>
+      <w:r>
+        <w:rPr>
+          <w:rFonts w:ascii="Times New Roman" w:hAnsi="Times New Roman" w:cs="Times New Roman"/>
+        </w:rPr>
+        <w:t>We star</w:t>
+      </w:r>
+      <w:r>
+        <w:rPr>
+          <w:rFonts w:ascii="Times New Roman" w:hAnsi="Times New Roman" w:cs="Times New Roman"/>
+        </w:rPr>
+        <w:t xml:space="preserve">t by splitting the array in half and then we keep doing that recursively on the left and right halves until we reach subarrays of less than two elements. Then we have pointers in each sorted subarray that compare each element and put the smaller one into a new array. Repeat the process until all elements from the subarrays are in the sorted array. </w:t>
+      </w:r>
+    </w:p>
+    <w:p>
+      <w:pPr>
+        <w:rPr>
+          <w:rFonts w:ascii="Times New Roman" w:hAnsi="Times New Roman" w:cs="Times New Roman"/>
+          <w:b/>
+          <w:bCs/>
+          <w:i/>
+          <w:iCs/>
+        </w:rPr>
+      </w:pPr>
       <w:r>
         <w:rPr>
           <w:rFonts w:ascii="Times New Roman" w:hAnsi="Times New Roman" w:cs="Times New Roman"/>
           <w:noProof/>
         </w:rPr>
         <w:drawing>
-          <wp:inline distT="0" distB="0" distL="0" distR="0" wp14:anchorId="5FA20885" wp14:editId="0C7A425E">
-            <wp:extent cx="2072005" cy="2719268"/>
-            <wp:effectExtent l="0" t="0" r="4445" b="5080"/>
+          <wp:inline distT="0" distB="0" distL="0" distR="0" wp14:anchorId="3FBC9852" wp14:editId="6FFBB9DD">
+            <wp:extent cx="1619250" cy="2514390"/>
+            <wp:effectExtent l="0" t="0" r="0" b="635"/>
             <wp:docPr id="2032015158" name="Picture 1" descr="A close-up of a white paper&#10;&#10;AI-generated content may be incorrect."/>
             <wp:cNvGraphicFramePr>
               <a:graphicFrameLocks xmlns:a="http://schemas.openxmlformats.org/drawingml/2006/main" noChangeAspect="1"/>
@@ -204,15 +973,15 @@
                         </a:ext>
                       </a:extLst>
                     </a:blip>
-                    <a:srcRect l="65137" t="14660" b="50003"/>
+                    <a:srcRect l="71617" t="16189" r="1121" b="51117"/>
                     <a:stretch>
                       <a:fillRect/>
                     </a:stretch>
                   </pic:blipFill>
                   <pic:spPr bwMode="auto">
-                    <a:xfrm>
+                    <a:xfrm rot="10800000">
                       <a:off x="0" y="0"/>
-                      <a:ext cx="2072103" cy="2719397"/>
+                      <a:ext cx="1620349" cy="2516096"/>
                     </a:xfrm>
                     <a:prstGeom prst="rect">
                       <a:avLst/>
@@ -237,597 +1006,183 @@
       <w:pPr>
         <w:rPr>
           <w:rFonts w:ascii="Times New Roman" w:hAnsi="Times New Roman" w:cs="Times New Roman"/>
-        </w:rPr>
-      </w:pPr>
-      <w:r>
-        <w:rPr>
-          <w:rFonts w:ascii="Times New Roman" w:hAnsi="Times New Roman" w:cs="Times New Roman"/>
-        </w:rPr>
-        <w:t>Abstract: Approximately 100–200 words describing what the paper is about.</w:t>
-      </w:r>
-    </w:p>
-    <w:p>
-      <w:pPr>
-        <w:rPr>
-          <w:rFonts w:ascii="Times New Roman" w:hAnsi="Times New Roman" w:cs="Times New Roman"/>
-        </w:rPr>
-      </w:pPr>
-      <w:r>
-        <w:rPr>
-          <w:rFonts w:ascii="Times New Roman" w:hAnsi="Times New Roman" w:cs="Times New Roman"/>
-        </w:rPr>
-        <w:t xml:space="preserve">Introduction: Describe the background and give a textual (not </w:t>
-      </w:r>
-      <w:proofErr w:type="gramStart"/>
-      <w:r>
-        <w:rPr>
-          <w:rFonts w:ascii="Times New Roman" w:hAnsi="Times New Roman" w:cs="Times New Roman"/>
-        </w:rPr>
-        <w:t>bulleted</w:t>
-      </w:r>
-      <w:proofErr w:type="gramEnd"/>
-      <w:r>
-        <w:rPr>
-          <w:rFonts w:ascii="Times New Roman" w:hAnsi="Times New Roman" w:cs="Times New Roman"/>
-        </w:rPr>
-        <w:t>) outline of the paper</w:t>
-      </w:r>
-    </w:p>
-    <w:p>
-      <w:pPr>
-        <w:rPr>
-          <w:rFonts w:ascii="Times New Roman" w:hAnsi="Times New Roman" w:cs="Times New Roman"/>
-        </w:rPr>
-      </w:pPr>
-      <w:r>
-        <w:rPr>
-          <w:rFonts w:ascii="Times New Roman" w:hAnsi="Times New Roman" w:cs="Times New Roman"/>
-        </w:rPr>
-        <w:t>One section per sorting algorithm, briefly describing how they work. For each algorithm, give the following:</w:t>
-      </w:r>
-    </w:p>
-    <w:p>
-      <w:pPr>
-        <w:rPr>
-          <w:rFonts w:ascii="Times New Roman" w:hAnsi="Times New Roman" w:cs="Times New Roman"/>
-        </w:rPr>
-      </w:pPr>
-      <w:proofErr w:type="gramStart"/>
-      <w:r>
-        <w:rPr>
-          <w:rFonts w:ascii="Times New Roman" w:hAnsi="Times New Roman" w:cs="Times New Roman"/>
-        </w:rPr>
-        <w:t>a textual</w:t>
-      </w:r>
-      <w:proofErr w:type="gramEnd"/>
-      <w:r>
-        <w:rPr>
-          <w:rFonts w:ascii="Times New Roman" w:hAnsi="Times New Roman" w:cs="Times New Roman"/>
-        </w:rPr>
-        <w:t xml:space="preserve"> description of how it works</w:t>
-      </w:r>
-    </w:p>
-    <w:p>
-      <w:pPr>
-        <w:rPr>
-          <w:rFonts w:ascii="Times New Roman" w:hAnsi="Times New Roman" w:cs="Times New Roman"/>
-        </w:rPr>
-      </w:pPr>
-      <w:r>
-        <w:rPr>
-          <w:rFonts w:ascii="Times New Roman" w:hAnsi="Times New Roman" w:cs="Times New Roman"/>
+          <w:b/>
+          <w:bCs/>
+          <w:i/>
+          <w:iCs/>
+        </w:rPr>
+      </w:pPr>
+      <w:r>
+        <w:rPr>
+          <w:rFonts w:ascii="Times New Roman" w:hAnsi="Times New Roman" w:cs="Times New Roman"/>
+          <w:b/>
+          <w:bCs/>
+          <w:i/>
+          <w:iCs/>
+        </w:rPr>
+        <w:t>Tree sort</w:t>
+      </w:r>
+    </w:p>
+    <w:p>
+      <w:pPr>
+        <w:rPr>
+          <w:rFonts w:ascii="Times New Roman" w:hAnsi="Times New Roman" w:cs="Times New Roman"/>
+        </w:rPr>
+      </w:pPr>
+      <w:r>
+        <w:rPr>
+          <w:rFonts w:ascii="Times New Roman" w:hAnsi="Times New Roman" w:cs="Times New Roman"/>
+          <w:b/>
+          <w:bCs/>
+          <w:i/>
+          <w:iCs/>
+        </w:rPr>
+        <w:tab/>
+      </w:r>
+      <w:r>
+        <w:rPr>
+          <w:rFonts w:ascii="Times New Roman" w:hAnsi="Times New Roman" w:cs="Times New Roman"/>
+        </w:rPr>
+        <w:t xml:space="preserve">Sort them into a binary search tree. Then just do in sort traversal to get the order. </w:t>
+      </w:r>
+    </w:p>
+    <w:p>
+      <w:pPr>
+        <w:rPr>
+          <w:rFonts w:ascii="Times New Roman" w:hAnsi="Times New Roman" w:cs="Times New Roman"/>
+          <w:b/>
+          <w:bCs/>
+          <w:i/>
+          <w:iCs/>
+        </w:rPr>
+      </w:pPr>
+      <w:r>
+        <w:rPr>
+          <w:rFonts w:ascii="Times New Roman" w:hAnsi="Times New Roman" w:cs="Times New Roman"/>
+          <w:noProof/>
         </w:rPr>
         <w:lastRenderedPageBreak/>
-        <w:t>a visualization showing key components of the algorithm, operating on the initial array [8, 6, 7, 5, 3, 0, 9] — do not copy images from your sources; that is copyright infringement</w:t>
-      </w:r>
-    </w:p>
-    <w:p>
-      <w:pPr>
-        <w:rPr>
-          <w:rFonts w:ascii="Times New Roman" w:hAnsi="Times New Roman" w:cs="Times New Roman"/>
-        </w:rPr>
-      </w:pPr>
-      <w:r>
-        <w:rPr>
-          <w:rFonts w:ascii="Times New Roman" w:hAnsi="Times New Roman" w:cs="Times New Roman"/>
-        </w:rPr>
-        <w:t>Methodology: Devise and describe an experiment that will tell you which algorithm performs the best under some metric. That might be any of “time elapsed”, “memory used”, “comparisons made”, and so on.</w:t>
-      </w:r>
-    </w:p>
-    <w:p>
-      <w:pPr>
-        <w:rPr>
-          <w:rFonts w:ascii="Times New Roman" w:hAnsi="Times New Roman" w:cs="Times New Roman"/>
-        </w:rPr>
-      </w:pPr>
-      <w:r>
-        <w:rPr>
-          <w:rFonts w:ascii="Times New Roman" w:hAnsi="Times New Roman" w:cs="Times New Roman"/>
-        </w:rPr>
-        <w:t>Results: Run your experiment and report what you saw. This is probably the most freeform section, and may include tables, graphs, etc. Present your data in a way that tells a story.</w:t>
-      </w:r>
-    </w:p>
-    <w:p>
-      <w:pPr>
-        <w:rPr>
-          <w:rFonts w:ascii="Times New Roman" w:hAnsi="Times New Roman" w:cs="Times New Roman"/>
-        </w:rPr>
-      </w:pPr>
-      <w:r>
-        <w:rPr>
-          <w:rFonts w:ascii="Times New Roman" w:hAnsi="Times New Roman" w:cs="Times New Roman"/>
-        </w:rPr>
-        <w:t xml:space="preserve">Conclusions: Summarize the paper and provide a </w:t>
-      </w:r>
-      <w:proofErr w:type="gramStart"/>
-      <w:r>
-        <w:rPr>
-          <w:rFonts w:ascii="Times New Roman" w:hAnsi="Times New Roman" w:cs="Times New Roman"/>
-        </w:rPr>
-        <w:t>launching</w:t>
-      </w:r>
-      <w:proofErr w:type="gramEnd"/>
-      <w:r>
-        <w:rPr>
-          <w:rFonts w:ascii="Times New Roman" w:hAnsi="Times New Roman" w:cs="Times New Roman"/>
-        </w:rPr>
-        <w:t xml:space="preserve"> point for further discussion.</w:t>
-      </w:r>
-    </w:p>
-    <w:p>
-      <w:pPr>
-        <w:rPr>
-          <w:rFonts w:ascii="Times New Roman" w:hAnsi="Times New Roman" w:cs="Times New Roman"/>
-        </w:rPr>
-      </w:pPr>
-      <w:r>
-        <w:rPr>
-          <w:rFonts w:ascii="Times New Roman" w:hAnsi="Times New Roman" w:cs="Times New Roman"/>
-        </w:rPr>
-        <w:t>References: List works that you cite in-text here.</w:t>
-      </w:r>
-    </w:p>
-    <w:p>
-      <w:pPr>
-        <w:rPr>
-          <w:rFonts w:ascii="Times New Roman" w:hAnsi="Times New Roman" w:cs="Times New Roman"/>
-        </w:rPr>
-      </w:pPr>
-      <w:r>
-        <w:rPr>
-          <w:rFonts w:ascii="Times New Roman" w:hAnsi="Times New Roman" w:cs="Times New Roman"/>
-        </w:rPr>
-        <w:t>Do not list anything that you do not cite in-text.</w:t>
-      </w:r>
-    </w:p>
-    <w:p>
-      <w:pPr>
-        <w:rPr>
-          <w:rFonts w:ascii="Times New Roman" w:hAnsi="Times New Roman" w:cs="Times New Roman"/>
-        </w:rPr>
-      </w:pPr>
-      <w:r>
-        <w:rPr>
-          <w:rFonts w:ascii="Times New Roman" w:hAnsi="Times New Roman" w:cs="Times New Roman"/>
-        </w:rPr>
-        <w:t xml:space="preserve">Any time that you are using ideas or words from another source, you absolutely </w:t>
-      </w:r>
-      <w:proofErr w:type="gramStart"/>
-      <w:r>
-        <w:rPr>
-          <w:rFonts w:ascii="Times New Roman" w:hAnsi="Times New Roman" w:cs="Times New Roman"/>
-        </w:rPr>
-        <w:t>have to</w:t>
-      </w:r>
-      <w:proofErr w:type="gramEnd"/>
-      <w:r>
-        <w:rPr>
-          <w:rFonts w:ascii="Times New Roman" w:hAnsi="Times New Roman" w:cs="Times New Roman"/>
-        </w:rPr>
-        <w:t xml:space="preserve"> cite that source in-text, like “On average, a binary search tree with n keys generated from a random series of insertions and removals of keys has expected height O(</w:t>
-      </w:r>
-      <w:proofErr w:type="spellStart"/>
-      <w:r>
-        <w:rPr>
-          <w:rFonts w:ascii="Times New Roman" w:hAnsi="Times New Roman" w:cs="Times New Roman"/>
-        </w:rPr>
-        <w:t>logn</w:t>
-      </w:r>
-      <w:proofErr w:type="spellEnd"/>
-      <w:r>
-        <w:rPr>
-          <w:rFonts w:ascii="Times New Roman" w:hAnsi="Times New Roman" w:cs="Times New Roman"/>
-        </w:rPr>
-        <w:t>) (Goodrich et al., 2014, p.470).”</w:t>
-      </w:r>
-    </w:p>
-    <w:p>
-      <w:pPr>
-        <w:rPr>
-          <w:rFonts w:ascii="Times New Roman" w:hAnsi="Times New Roman" w:cs="Times New Roman"/>
-        </w:rPr>
-      </w:pPr>
-      <w:r>
-        <w:rPr>
-          <w:rFonts w:ascii="Times New Roman" w:hAnsi="Times New Roman" w:cs="Times New Roman"/>
-        </w:rPr>
-        <w:t>Appendix: Include the entire source code of your implementation typeset into the document.</w:t>
-      </w:r>
-    </w:p>
-    <w:p>
-      <w:pPr>
-        <w:rPr>
-          <w:rFonts w:ascii="Times New Roman" w:hAnsi="Times New Roman" w:cs="Times New Roman"/>
-        </w:rPr>
-      </w:pPr>
-      <w:r>
-        <w:rPr>
-          <w:rFonts w:ascii="Times New Roman" w:hAnsi="Times New Roman" w:cs="Times New Roman"/>
-        </w:rPr>
-        <w:t>Log: Include a transcript of your git log.</w:t>
-      </w:r>
-    </w:p>
-    <w:p>
-      <w:pPr>
-        <w:rPr>
-          <w:rFonts w:ascii="Times New Roman" w:hAnsi="Times New Roman" w:cs="Times New Roman"/>
-          <w:b/>
-          <w:bCs/>
-        </w:rPr>
-      </w:pPr>
-      <w:r>
-        <w:rPr>
-          <w:rFonts w:ascii="Times New Roman" w:hAnsi="Times New Roman" w:cs="Times New Roman"/>
-          <w:b/>
-          <w:bCs/>
-        </w:rPr>
-        <w:t>Abstract</w:t>
-      </w:r>
-    </w:p>
-    <w:p>
-      <w:pPr>
-        <w:rPr>
-          <w:rFonts w:ascii="Times New Roman" w:hAnsi="Times New Roman" w:cs="Times New Roman"/>
-        </w:rPr>
-      </w:pPr>
-    </w:p>
-    <w:p>
-      <w:pPr>
-        <w:rPr>
-          <w:rFonts w:ascii="Times New Roman" w:hAnsi="Times New Roman" w:cs="Times New Roman"/>
-          <w:b/>
-          <w:bCs/>
-        </w:rPr>
-      </w:pPr>
-      <w:r>
-        <w:rPr>
-          <w:rFonts w:ascii="Times New Roman" w:hAnsi="Times New Roman" w:cs="Times New Roman"/>
-          <w:b/>
-          <w:bCs/>
-        </w:rPr>
-        <w:t>Introduction</w:t>
-      </w:r>
-    </w:p>
-    <w:p>
-      <w:pPr>
-        <w:rPr>
-          <w:rFonts w:ascii="Times New Roman" w:hAnsi="Times New Roman" w:cs="Times New Roman"/>
-        </w:rPr>
-      </w:pPr>
-    </w:p>
-    <w:p>
-      <w:pPr>
-        <w:rPr>
-          <w:rFonts w:ascii="Times New Roman" w:hAnsi="Times New Roman" w:cs="Times New Roman"/>
-          <w:b/>
-          <w:bCs/>
-          <w:i/>
-          <w:iCs/>
-        </w:rPr>
-      </w:pPr>
-      <w:r>
-        <w:rPr>
-          <w:rFonts w:ascii="Times New Roman" w:hAnsi="Times New Roman" w:cs="Times New Roman"/>
-          <w:b/>
-          <w:bCs/>
-          <w:i/>
-          <w:iCs/>
-        </w:rPr>
-        <w:t>Heapsort</w:t>
-      </w:r>
-    </w:p>
-    <w:p>
-      <w:pPr>
-        <w:rPr>
-          <w:rFonts w:ascii="Times New Roman" w:hAnsi="Times New Roman" w:cs="Times New Roman"/>
-        </w:rPr>
-      </w:pPr>
-      <w:r>
-        <w:rPr>
-          <w:rFonts w:ascii="Times New Roman" w:hAnsi="Times New Roman" w:cs="Times New Roman"/>
-          <w:b/>
-          <w:bCs/>
-          <w:i/>
-          <w:iCs/>
+        <w:drawing>
+          <wp:inline distT="0" distB="0" distL="0" distR="0" wp14:anchorId="2E34795B" wp14:editId="2E206888">
+            <wp:extent cx="2247435" cy="1809115"/>
+            <wp:effectExtent l="0" t="0" r="635" b="635"/>
+            <wp:docPr id="1198555381" name="Picture 1" descr="A close-up of a white paper&#10;&#10;AI-generated content may be incorrect."/>
+            <wp:cNvGraphicFramePr>
+              <a:graphicFrameLocks xmlns:a="http://schemas.openxmlformats.org/drawingml/2006/main" noChangeAspect="1"/>
+            </wp:cNvGraphicFramePr>
+            <a:graphic xmlns:a="http://schemas.openxmlformats.org/drawingml/2006/main">
+              <a:graphicData uri="http://schemas.openxmlformats.org/drawingml/2006/picture">
+                <pic:pic xmlns:pic="http://schemas.openxmlformats.org/drawingml/2006/picture">
+                  <pic:nvPicPr>
+                    <pic:cNvPr id="2032015158" name="Picture 1" descr="A close-up of a white paper&#10;&#10;AI-generated content may be incorrect."/>
+                    <pic:cNvPicPr/>
+                  </pic:nvPicPr>
+                  <pic:blipFill rotWithShape="1">
+                    <a:blip r:embed="rId5" cstate="print">
+                      <a:extLst>
+                        <a:ext uri="{28A0092B-C50C-407E-A947-70E740481C1C}">
+                          <a14:useLocalDpi xmlns:a14="http://schemas.microsoft.com/office/drawing/2010/main" val="0"/>
+                        </a:ext>
+                      </a:extLst>
+                    </a:blip>
+                    <a:srcRect l="9460" t="54016" r="52708" b="22464"/>
+                    <a:stretch>
+                      <a:fillRect/>
+                    </a:stretch>
+                  </pic:blipFill>
+                  <pic:spPr bwMode="auto">
+                    <a:xfrm rot="10800000">
+                      <a:off x="0" y="0"/>
+                      <a:ext cx="2248549" cy="1810012"/>
+                    </a:xfrm>
+                    <a:prstGeom prst="rect">
+                      <a:avLst/>
+                    </a:prstGeom>
+                    <a:ln>
+                      <a:noFill/>
+                    </a:ln>
+                    <a:extLst>
+                      <a:ext uri="{53640926-AAD7-44D8-BBD7-CCE9431645EC}">
+                        <a14:shadowObscured xmlns:a14="http://schemas.microsoft.com/office/drawing/2010/main"/>
+                      </a:ext>
+                    </a:extLst>
+                  </pic:spPr>
+                </pic:pic>
+              </a:graphicData>
+            </a:graphic>
+          </wp:inline>
+        </w:drawing>
+      </w:r>
+    </w:p>
+    <w:p>
+      <w:pPr>
+        <w:rPr>
+          <w:rFonts w:ascii="Times New Roman" w:hAnsi="Times New Roman" w:cs="Times New Roman"/>
+          <w:b/>
+          <w:bCs/>
+          <w:i/>
+          <w:iCs/>
+        </w:rPr>
+      </w:pPr>
+      <w:r>
+        <w:rPr>
+          <w:rFonts w:ascii="Times New Roman" w:hAnsi="Times New Roman" w:cs="Times New Roman"/>
+          <w:b/>
+          <w:bCs/>
+          <w:i/>
+          <w:iCs/>
+        </w:rPr>
+        <w:t>Insertion sort</w:t>
+      </w:r>
+    </w:p>
+    <w:p>
+      <w:pPr>
+        <w:rPr>
+          <w:rFonts w:ascii="Times New Roman" w:hAnsi="Times New Roman" w:cs="Times New Roman"/>
+          <w:b/>
+          <w:bCs/>
+        </w:rPr>
+      </w:pPr>
+      <w:r>
+        <w:rPr>
+          <w:rFonts w:ascii="Times New Roman" w:hAnsi="Times New Roman" w:cs="Times New Roman"/>
+          <w:b/>
+          <w:bCs/>
+        </w:rPr>
+        <w:t>Methodology</w:t>
+      </w:r>
+    </w:p>
+    <w:p>
+      <w:pPr>
+        <w:rPr>
+          <w:rFonts w:ascii="Times New Roman" w:hAnsi="Times New Roman" w:cs="Times New Roman"/>
+        </w:rPr>
+      </w:pPr>
+      <w:r>
+        <w:rPr>
+          <w:rFonts w:ascii="Times New Roman" w:hAnsi="Times New Roman" w:cs="Times New Roman"/>
+          <w:b/>
+          <w:bCs/>
         </w:rPr>
         <w:tab/>
       </w:r>
-    </w:p>
-    <w:p>
-      <w:pPr>
-        <w:rPr>
-          <w:rFonts w:ascii="Times New Roman" w:hAnsi="Times New Roman" w:cs="Times New Roman"/>
-          <w:b/>
-          <w:bCs/>
-          <w:i/>
-          <w:iCs/>
-        </w:rPr>
-      </w:pPr>
-      <w:r>
-        <w:rPr>
-          <w:rFonts w:ascii="Times New Roman" w:hAnsi="Times New Roman" w:cs="Times New Roman"/>
-          <w:b/>
-          <w:bCs/>
-          <w:i/>
-          <w:iCs/>
-        </w:rPr>
-        <w:t xml:space="preserve">Merge </w:t>
-      </w:r>
-      <w:proofErr w:type="gramStart"/>
-      <w:r>
-        <w:rPr>
-          <w:rFonts w:ascii="Times New Roman" w:hAnsi="Times New Roman" w:cs="Times New Roman"/>
-          <w:b/>
-          <w:bCs/>
-          <w:i/>
-          <w:iCs/>
-        </w:rPr>
-        <w:t>sort</w:t>
-      </w:r>
-      <w:proofErr w:type="gramEnd"/>
-    </w:p>
-    <w:p>
-      <w:pPr>
-        <w:rPr>
-          <w:rFonts w:ascii="Times New Roman" w:hAnsi="Times New Roman" w:cs="Times New Roman"/>
-        </w:rPr>
-      </w:pPr>
-      <w:r>
-        <w:rPr>
-          <w:rFonts w:ascii="Times New Roman" w:hAnsi="Times New Roman" w:cs="Times New Roman"/>
-        </w:rPr>
-        <w:tab/>
-        <w:t xml:space="preserve">It starts by dividing the </w:t>
-      </w:r>
-      <w:proofErr w:type="gramStart"/>
-      <w:r>
-        <w:rPr>
-          <w:rFonts w:ascii="Times New Roman" w:hAnsi="Times New Roman" w:cs="Times New Roman"/>
-        </w:rPr>
-        <w:t>elements</w:t>
-      </w:r>
-      <w:proofErr w:type="gramEnd"/>
-      <w:r>
-        <w:rPr>
-          <w:rFonts w:ascii="Times New Roman" w:hAnsi="Times New Roman" w:cs="Times New Roman"/>
-        </w:rPr>
-        <w:t xml:space="preserve"> half and then </w:t>
-      </w:r>
-      <w:proofErr w:type="gramStart"/>
-      <w:r>
-        <w:rPr>
-          <w:rFonts w:ascii="Times New Roman" w:hAnsi="Times New Roman" w:cs="Times New Roman"/>
-        </w:rPr>
-        <w:t>keep</w:t>
-      </w:r>
-      <w:proofErr w:type="gramEnd"/>
-      <w:r>
-        <w:rPr>
-          <w:rFonts w:ascii="Times New Roman" w:hAnsi="Times New Roman" w:cs="Times New Roman"/>
-        </w:rPr>
-        <w:t xml:space="preserve"> recursively dividing until they are only one. Then we merge them </w:t>
-      </w:r>
-      <w:proofErr w:type="gramStart"/>
-      <w:r>
-        <w:rPr>
-          <w:rFonts w:ascii="Times New Roman" w:hAnsi="Times New Roman" w:cs="Times New Roman"/>
-        </w:rPr>
-        <w:t>comparing  the</w:t>
-      </w:r>
-      <w:proofErr w:type="gramEnd"/>
-      <w:r>
-        <w:rPr>
-          <w:rFonts w:ascii="Times New Roman" w:hAnsi="Times New Roman" w:cs="Times New Roman"/>
-        </w:rPr>
-        <w:t xml:space="preserve"> numbers.</w:t>
-      </w:r>
-    </w:p>
-    <w:p>
-      <w:pPr>
-        <w:rPr>
-          <w:rFonts w:ascii="Times New Roman" w:hAnsi="Times New Roman" w:cs="Times New Roman"/>
-          <w:b/>
-          <w:bCs/>
-          <w:i/>
-          <w:iCs/>
-        </w:rPr>
-      </w:pPr>
-      <w:r>
-        <w:rPr>
-          <w:rFonts w:ascii="Times New Roman" w:hAnsi="Times New Roman" w:cs="Times New Roman"/>
-          <w:b/>
-          <w:bCs/>
-          <w:i/>
-          <w:iCs/>
-        </w:rPr>
-        <w:t>Quicksort</w:t>
-      </w:r>
-    </w:p>
-    <w:p>
-      <w:pPr>
-        <w:rPr>
-          <w:rFonts w:ascii="Times New Roman" w:hAnsi="Times New Roman" w:cs="Times New Roman"/>
-        </w:rPr>
-      </w:pPr>
-      <w:r>
-        <w:rPr>
-          <w:rFonts w:ascii="Times New Roman" w:hAnsi="Times New Roman" w:cs="Times New Roman"/>
-          <w:b/>
-          <w:bCs/>
-          <w:i/>
-          <w:iCs/>
-        </w:rPr>
-        <w:tab/>
-      </w:r>
-      <w:r>
-        <w:rPr>
-          <w:rFonts w:ascii="Times New Roman" w:hAnsi="Times New Roman" w:cs="Times New Roman"/>
-        </w:rPr>
-        <w:t xml:space="preserve">You get a pivot. Then divide between </w:t>
-      </w:r>
-      <w:r>
-        <w:rPr>
-          <w:rFonts w:ascii="Times New Roman" w:hAnsi="Times New Roman" w:cs="Times New Roman"/>
-        </w:rPr>
-        <w:t>lesser and greater numbers and the reassemble backwards.</w:t>
-      </w:r>
-    </w:p>
-    <w:p>
-      <w:pPr>
-        <w:rPr>
-          <w:rFonts w:ascii="Times New Roman" w:hAnsi="Times New Roman" w:cs="Times New Roman"/>
-          <w:b/>
-          <w:bCs/>
-          <w:i/>
-          <w:iCs/>
-        </w:rPr>
-      </w:pPr>
-      <w:r>
-        <w:rPr>
-          <w:rFonts w:ascii="Times New Roman" w:hAnsi="Times New Roman" w:cs="Times New Roman"/>
-          <w:b/>
-          <w:bCs/>
-          <w:i/>
-          <w:iCs/>
-        </w:rPr>
-        <w:t xml:space="preserve">Tree </w:t>
-      </w:r>
-      <w:proofErr w:type="gramStart"/>
-      <w:r>
-        <w:rPr>
-          <w:rFonts w:ascii="Times New Roman" w:hAnsi="Times New Roman" w:cs="Times New Roman"/>
-          <w:b/>
-          <w:bCs/>
-          <w:i/>
-          <w:iCs/>
-        </w:rPr>
-        <w:t>sort</w:t>
-      </w:r>
-      <w:proofErr w:type="gramEnd"/>
-    </w:p>
-    <w:p>
-      <w:pPr>
-        <w:rPr>
-          <w:rFonts w:ascii="Times New Roman" w:hAnsi="Times New Roman" w:cs="Times New Roman"/>
-        </w:rPr>
-      </w:pPr>
-      <w:r>
-        <w:rPr>
-          <w:rFonts w:ascii="Times New Roman" w:hAnsi="Times New Roman" w:cs="Times New Roman"/>
-          <w:b/>
-          <w:bCs/>
-          <w:i/>
-          <w:iCs/>
-        </w:rPr>
-        <w:tab/>
-      </w:r>
-      <w:r>
-        <w:rPr>
-          <w:rFonts w:ascii="Times New Roman" w:hAnsi="Times New Roman" w:cs="Times New Roman"/>
-        </w:rPr>
-        <w:t xml:space="preserve">Sort them into a binary search tree. Then just do in sort traversal to get the order. </w:t>
-      </w:r>
-    </w:p>
-    <w:p>
-      <w:pPr>
-        <w:rPr>
-          <w:rFonts w:ascii="Times New Roman" w:hAnsi="Times New Roman" w:cs="Times New Roman"/>
-          <w:b/>
-          <w:bCs/>
-          <w:i/>
-          <w:iCs/>
-        </w:rPr>
-      </w:pPr>
-      <w:r>
-        <w:rPr>
-          <w:rFonts w:ascii="Times New Roman" w:hAnsi="Times New Roman" w:cs="Times New Roman"/>
-          <w:b/>
-          <w:bCs/>
-          <w:i/>
-          <w:iCs/>
-        </w:rPr>
-        <w:t>Your fifth choice</w:t>
-      </w:r>
-    </w:p>
-    <w:p>
-      <w:pPr>
-        <w:rPr>
-          <w:rFonts w:ascii="Times New Roman" w:hAnsi="Times New Roman" w:cs="Times New Roman"/>
-          <w:b/>
-          <w:bCs/>
-        </w:rPr>
-      </w:pPr>
-      <w:r>
-        <w:rPr>
-          <w:rFonts w:ascii="Times New Roman" w:hAnsi="Times New Roman" w:cs="Times New Roman"/>
-          <w:b/>
-          <w:bCs/>
-        </w:rPr>
-        <w:lastRenderedPageBreak/>
-        <w:t>Methodology</w:t>
-      </w:r>
-    </w:p>
-    <w:p>
-      <w:pPr>
-        <w:rPr>
-          <w:rFonts w:ascii="Times New Roman" w:hAnsi="Times New Roman" w:cs="Times New Roman"/>
-        </w:rPr>
-      </w:pPr>
-      <w:r>
-        <w:rPr>
-          <w:rFonts w:ascii="Times New Roman" w:hAnsi="Times New Roman" w:cs="Times New Roman"/>
-          <w:b/>
-          <w:bCs/>
-        </w:rPr>
-        <w:tab/>
-      </w:r>
-      <w:proofErr w:type="gramStart"/>
-      <w:r>
-        <w:rPr>
-          <w:rFonts w:ascii="Times New Roman" w:hAnsi="Times New Roman" w:cs="Times New Roman"/>
-        </w:rPr>
-        <w:t>Basically</w:t>
-      </w:r>
-      <w:proofErr w:type="gramEnd"/>
-      <w:r>
-        <w:rPr>
-          <w:rFonts w:ascii="Times New Roman" w:hAnsi="Times New Roman" w:cs="Times New Roman"/>
-        </w:rPr>
-        <w:t xml:space="preserve"> for the methodology we are creating 20,000 random integers and then sorting them under the different sorting algorithms, we will compare who does less </w:t>
-      </w:r>
-      <w:proofErr w:type="gramStart"/>
-      <w:r>
-        <w:rPr>
-          <w:rFonts w:ascii="Times New Roman" w:hAnsi="Times New Roman" w:cs="Times New Roman"/>
-        </w:rPr>
-        <w:t>element to element</w:t>
-      </w:r>
-      <w:proofErr w:type="gramEnd"/>
-      <w:r>
-        <w:rPr>
-          <w:rFonts w:ascii="Times New Roman" w:hAnsi="Times New Roman" w:cs="Times New Roman"/>
-        </w:rPr>
-        <w:t xml:space="preserve"> comparisons. </w:t>
+      <w:r>
+        <w:rPr>
+          <w:rFonts w:ascii="Times New Roman" w:hAnsi="Times New Roman" w:cs="Times New Roman"/>
+        </w:rPr>
+        <w:t xml:space="preserve">The purpose of this experiment is to compare the efficiency of five common sorting algorithms (heapsort, quicksort, merge sort, tree sort, insertion sort) by tracking the number of comparisons between elements that they make when sorting arrays of integers. Inspired by the assignment we had in H6, I decided to do a similar task of generating arrays of 20,000 random integers and sorting them with the different sorting algorithms that we have. However, in order to try to take into account the possible cases in which some algorithms might do better than others depending on how the integers are arranged in the arrays, I decided to do the average element comparisons </w:t>
+      </w:r>
+      <w:r>
+        <w:rPr>
+          <w:rFonts w:ascii="Times New Roman" w:hAnsi="Times New Roman" w:cs="Times New Roman"/>
+        </w:rPr>
+        <w:t xml:space="preserve">from sorting 5 arrays instead of just taking the comparisons from one random array. </w:t>
+      </w:r>
+      <w:r>
+        <w:rPr>
+          <w:rFonts w:ascii="Times New Roman" w:hAnsi="Times New Roman" w:cs="Times New Roman"/>
+        </w:rPr>
+        <w:t xml:space="preserve"> </w:t>
       </w:r>
     </w:p>
     <w:p>
@@ -1651,7 +2006,6 @@
   <w:style w:type="character" w:default="1" w:styleId="DefaultParagraphFont">
     <w:name w:val="Default Paragraph Font"/>
     <w:uiPriority w:val="1"/>
-    <w:semiHidden/>
     <w:unhideWhenUsed/>
   </w:style>
   <w:style w:type="table" w:default="1" w:styleId="TableNormal">

</xml_diff>

<commit_message>
Finishing the intro and working on the code for insertion sort
</commit_message>
<xml_diff>
--- a/P2.docx
+++ b/P2.docx
@@ -25,7 +25,21 @@
         <w:rPr>
           <w:rFonts w:ascii="Times New Roman" w:hAnsi="Times New Roman" w:cs="Times New Roman"/>
         </w:rPr>
-        <w:t>Introduction: Describe the background and give a textual (not bulleted) outline of the paper</w:t>
+        <w:t xml:space="preserve">Introduction: Describe the background and give a textual (not </w:t>
+      </w:r>
+      <w:proofErr w:type="gramStart"/>
+      <w:r>
+        <w:rPr>
+          <w:rFonts w:ascii="Times New Roman" w:hAnsi="Times New Roman" w:cs="Times New Roman"/>
+        </w:rPr>
+        <w:t>bulleted</w:t>
+      </w:r>
+      <w:proofErr w:type="gramEnd"/>
+      <w:r>
+        <w:rPr>
+          <w:rFonts w:ascii="Times New Roman" w:hAnsi="Times New Roman" w:cs="Times New Roman"/>
+        </w:rPr>
+        <w:t>) outline of the paper</w:t>
       </w:r>
     </w:p>
     <w:p>
@@ -47,11 +61,19 @@
           <w:rFonts w:ascii="Times New Roman" w:hAnsi="Times New Roman" w:cs="Times New Roman"/>
         </w:rPr>
       </w:pPr>
-      <w:r>
-        <w:rPr>
-          <w:rFonts w:ascii="Times New Roman" w:hAnsi="Times New Roman" w:cs="Times New Roman"/>
-        </w:rPr>
-        <w:t>a textual description of how it works</w:t>
+      <w:proofErr w:type="gramStart"/>
+      <w:r>
+        <w:rPr>
+          <w:rFonts w:ascii="Times New Roman" w:hAnsi="Times New Roman" w:cs="Times New Roman"/>
+        </w:rPr>
+        <w:t>a textual</w:t>
+      </w:r>
+      <w:proofErr w:type="gramEnd"/>
+      <w:r>
+        <w:rPr>
+          <w:rFonts w:ascii="Times New Roman" w:hAnsi="Times New Roman" w:cs="Times New Roman"/>
+        </w:rPr>
+        <w:t xml:space="preserve"> description of how it works</w:t>
       </w:r>
     </w:p>
     <w:p>
@@ -103,7 +125,21 @@
         <w:rPr>
           <w:rFonts w:ascii="Times New Roman" w:hAnsi="Times New Roman" w:cs="Times New Roman"/>
         </w:rPr>
-        <w:t>Conclusions: Summarize the paper and provide a launching point for further discussion.</w:t>
+        <w:t xml:space="preserve">Conclusions: Summarize the paper and provide a </w:t>
+      </w:r>
+      <w:proofErr w:type="gramStart"/>
+      <w:r>
+        <w:rPr>
+          <w:rFonts w:ascii="Times New Roman" w:hAnsi="Times New Roman" w:cs="Times New Roman"/>
+        </w:rPr>
+        <w:t>launching</w:t>
+      </w:r>
+      <w:proofErr w:type="gramEnd"/>
+      <w:r>
+        <w:rPr>
+          <w:rFonts w:ascii="Times New Roman" w:hAnsi="Times New Roman" w:cs="Times New Roman"/>
+        </w:rPr>
+        <w:t xml:space="preserve"> point for further discussion.</w:t>
       </w:r>
     </w:p>
     <w:p>
@@ -142,7 +178,21 @@
         <w:rPr>
           <w:rFonts w:ascii="Times New Roman" w:hAnsi="Times New Roman" w:cs="Times New Roman"/>
         </w:rPr>
-        <w:t>Any time that you are using ideas or words from another source, you absolutely have to cite that source in-text, like “On average, a binary search tree with n keys generated from a random series of insertions and removals of keys has expected height O(</w:t>
+        <w:t xml:space="preserve">Any time that you are using ideas or words from another source, you absolutely </w:t>
+      </w:r>
+      <w:proofErr w:type="gramStart"/>
+      <w:r>
+        <w:rPr>
+          <w:rFonts w:ascii="Times New Roman" w:hAnsi="Times New Roman" w:cs="Times New Roman"/>
+        </w:rPr>
+        <w:t>have to</w:t>
+      </w:r>
+      <w:proofErr w:type="gramEnd"/>
+      <w:r>
+        <w:rPr>
+          <w:rFonts w:ascii="Times New Roman" w:hAnsi="Times New Roman" w:cs="Times New Roman"/>
+        </w:rPr>
+        <w:t xml:space="preserve"> cite that source in-text, like “On average, a binary search tree with n keys generated from a random series of insertions and removals of keys has expected height O(</w:t>
       </w:r>
       <w:proofErr w:type="spellStart"/>
       <w:r>
@@ -232,6 +282,90 @@
           <w:rFonts w:ascii="Times New Roman" w:hAnsi="Times New Roman" w:cs="Times New Roman"/>
         </w:rPr>
       </w:pPr>
+      <w:r>
+        <w:rPr>
+          <w:rFonts w:ascii="Times New Roman" w:hAnsi="Times New Roman" w:cs="Times New Roman"/>
+        </w:rPr>
+        <w:tab/>
+        <w:t>Sorting algorithms are algorithms that help us put elements into a specific order, usually numerical order</w:t>
+      </w:r>
+      <w:r>
+        <w:rPr>
+          <w:rFonts w:ascii="Times New Roman" w:hAnsi="Times New Roman" w:cs="Times New Roman"/>
+        </w:rPr>
+        <w:t xml:space="preserve">, which can be ascending or descending. This is helpful whenever we need to process data that comes in random arrangements and we need it to be ordered in a specific way. In class, we have discussed different qualities of sorting algorithms. The first one is the time complexity, or the time that the algorithm takes depending on its input. There is also </w:t>
+      </w:r>
+      <w:r>
+        <w:rPr>
+          <w:rFonts w:ascii="Times New Roman" w:hAnsi="Times New Roman" w:cs="Times New Roman"/>
+        </w:rPr>
+        <w:t>stability</w:t>
+      </w:r>
+      <w:r>
+        <w:rPr>
+          <w:rFonts w:ascii="Times New Roman" w:hAnsi="Times New Roman" w:cs="Times New Roman"/>
+        </w:rPr>
+        <w:t xml:space="preserve">, </w:t>
+      </w:r>
+      <w:r>
+        <w:rPr>
+          <w:rFonts w:ascii="Times New Roman" w:hAnsi="Times New Roman" w:cs="Times New Roman"/>
+        </w:rPr>
+        <w:t xml:space="preserve">which basically tells us if the algorithm maintains the relative order of the elements with </w:t>
+      </w:r>
+      <w:proofErr w:type="gramStart"/>
+      <w:r>
+        <w:rPr>
+          <w:rFonts w:ascii="Times New Roman" w:hAnsi="Times New Roman" w:cs="Times New Roman"/>
+        </w:rPr>
+        <w:t>equal sort</w:t>
+      </w:r>
+      <w:proofErr w:type="gramEnd"/>
+      <w:r>
+        <w:rPr>
+          <w:rFonts w:ascii="Times New Roman" w:hAnsi="Times New Roman" w:cs="Times New Roman"/>
+        </w:rPr>
+        <w:t xml:space="preserve"> keys (e.g., age, class, weight) or not </w:t>
+      </w:r>
+      <w:r>
+        <w:rPr>
+          <w:rFonts w:ascii="Times New Roman" w:hAnsi="Times New Roman" w:cs="Times New Roman"/>
+        </w:rPr>
+        <w:t>(Harrison, 2018)</w:t>
+      </w:r>
+      <w:r>
+        <w:rPr>
+          <w:rFonts w:ascii="Times New Roman" w:hAnsi="Times New Roman" w:cs="Times New Roman"/>
+        </w:rPr>
+        <w:t xml:space="preserve">. We can also look at their auxiliary space, which is just the extra space taken by the algorithm temporarily to do the job. In this </w:t>
+      </w:r>
+      <w:r>
+        <w:rPr>
+          <w:rFonts w:ascii="Times New Roman" w:hAnsi="Times New Roman" w:cs="Times New Roman"/>
+        </w:rPr>
+        <w:lastRenderedPageBreak/>
+        <w:t xml:space="preserve">paper, I will be discussing five different sorting </w:t>
+      </w:r>
+      <w:proofErr w:type="gramStart"/>
+      <w:r>
+        <w:rPr>
+          <w:rFonts w:ascii="Times New Roman" w:hAnsi="Times New Roman" w:cs="Times New Roman"/>
+        </w:rPr>
+        <w:t>algorithms, and</w:t>
+      </w:r>
+      <w:proofErr w:type="gramEnd"/>
+      <w:r>
+        <w:rPr>
+          <w:rFonts w:ascii="Times New Roman" w:hAnsi="Times New Roman" w:cs="Times New Roman"/>
+        </w:rPr>
+        <w:t xml:space="preserve"> will do an experiment that is looking into their efficiency when it comes to doing element to element comparisons.  </w:t>
+      </w:r>
+      <w:r>
+        <w:rPr>
+          <w:rFonts w:ascii="Times New Roman" w:hAnsi="Times New Roman" w:cs="Times New Roman"/>
+        </w:rPr>
+        <w:t xml:space="preserve"> </w:t>
+      </w:r>
     </w:p>
     <w:p>
       <w:pPr>
@@ -286,7 +420,7 @@
         <w:rPr>
           <w:rFonts w:ascii="Times New Roman" w:hAnsi="Times New Roman" w:cs="Times New Roman"/>
         </w:rPr>
-        <w:t>a</w:t>
+        <w:t>b</w:t>
       </w:r>
       <w:r>
         <w:rPr>
@@ -310,8 +444,16 @@
         <w:rPr>
           <w:rFonts w:ascii="Times New Roman" w:hAnsi="Times New Roman" w:cs="Times New Roman"/>
         </w:rPr>
-        <w:t>. Because it is a binary heap, this sorting algorithm has an efficient time complexity of O(</w:t>
-      </w:r>
+        <w:t xml:space="preserve">. Because it is a binary heap, this sorting algorithm has an efficient time complexity of </w:t>
+      </w:r>
+      <w:proofErr w:type="gramStart"/>
+      <w:r>
+        <w:rPr>
+          <w:rFonts w:ascii="Times New Roman" w:hAnsi="Times New Roman" w:cs="Times New Roman"/>
+        </w:rPr>
+        <w:t>O(</w:t>
+      </w:r>
+      <w:proofErr w:type="gramEnd"/>
       <w:r>
         <w:rPr>
           <w:rFonts w:ascii="Times New Roman" w:hAnsi="Times New Roman" w:cs="Times New Roman"/>
@@ -401,7 +543,6 @@
         <w:rPr>
           <w:rFonts w:ascii="Times New Roman" w:hAnsi="Times New Roman" w:cs="Times New Roman"/>
         </w:rPr>
-        <w:lastRenderedPageBreak/>
         <w:tab/>
       </w:r>
       <w:r>
@@ -599,13 +740,32 @@
         <w:rPr>
           <w:rFonts w:ascii="Times New Roman" w:hAnsi="Times New Roman" w:cs="Times New Roman"/>
         </w:rPr>
-        <w:t xml:space="preserve">Developed in 1959 by Tony Hoare and published in 1961 (Wikipedia, 2025b). </w:t>
-      </w:r>
-      <w:r>
-        <w:rPr>
-          <w:rFonts w:ascii="Times New Roman" w:hAnsi="Times New Roman" w:cs="Times New Roman"/>
-        </w:rPr>
-        <w:t xml:space="preserve">It is one of the divide-and-conquer algorithms, where they take a problem and divide it into tinier subproblems, recursively solves them and then combines the solutions </w:t>
+        <w:t>Developed in 1959 by Tony Hoare and published in 1961 (Wikipedia, 2025</w:t>
+      </w:r>
+      <w:r>
+        <w:rPr>
+          <w:rFonts w:ascii="Times New Roman" w:hAnsi="Times New Roman" w:cs="Times New Roman"/>
+        </w:rPr>
+        <w:t>c</w:t>
+      </w:r>
+      <w:r>
+        <w:rPr>
+          <w:rFonts w:ascii="Times New Roman" w:hAnsi="Times New Roman" w:cs="Times New Roman"/>
+        </w:rPr>
+        <w:t xml:space="preserve">). </w:t>
+      </w:r>
+      <w:r>
+        <w:rPr>
+          <w:rFonts w:ascii="Times New Roman" w:hAnsi="Times New Roman" w:cs="Times New Roman"/>
+        </w:rPr>
+        <w:t xml:space="preserve">It is one of the divide-and-conquer algorithms, where they take a problem and divide it into tinier </w:t>
+      </w:r>
+      <w:r>
+        <w:rPr>
+          <w:rFonts w:ascii="Times New Roman" w:hAnsi="Times New Roman" w:cs="Times New Roman"/>
+        </w:rPr>
+        <w:lastRenderedPageBreak/>
+        <w:t xml:space="preserve">subproblems, recursively solves them and then combines the solutions </w:t>
       </w:r>
       <w:r>
         <w:rPr>
@@ -698,7 +858,6 @@
           <w:rFonts w:ascii="Times New Roman" w:hAnsi="Times New Roman" w:cs="Times New Roman"/>
           <w:noProof/>
         </w:rPr>
-        <w:lastRenderedPageBreak/>
         <w:drawing>
           <wp:inline distT="0" distB="0" distL="0" distR="0" wp14:anchorId="15234643" wp14:editId="547DBC34">
             <wp:extent cx="3764280" cy="1851831"/>
@@ -769,8 +928,20 @@
           <w:i/>
           <w:iCs/>
         </w:rPr>
-        <w:t>Merge sort</w:t>
-      </w:r>
+        <w:t xml:space="preserve">Merge </w:t>
+      </w:r>
+      <w:proofErr w:type="gramStart"/>
+      <w:r>
+        <w:rPr>
+          <w:rFonts w:ascii="Times New Roman" w:hAnsi="Times New Roman" w:cs="Times New Roman"/>
+          <w:b/>
+          <w:bCs/>
+          <w:i/>
+          <w:iCs/>
+        </w:rPr>
+        <w:t>sort</w:t>
+      </w:r>
+      <w:proofErr w:type="gramEnd"/>
     </w:p>
     <w:p>
       <w:pPr>
@@ -820,6 +991,7 @@
         </w:rPr>
         <w:t xml:space="preserve"> It has a time complexity of </w:t>
       </w:r>
+      <w:proofErr w:type="gramStart"/>
       <w:r>
         <w:rPr>
           <w:rFonts w:ascii="Times New Roman" w:hAnsi="Times New Roman" w:cs="Times New Roman"/>
@@ -832,6 +1004,7 @@
         </w:rPr>
         <w:t>(</w:t>
       </w:r>
+      <w:proofErr w:type="gramEnd"/>
       <w:r>
         <w:rPr>
           <w:rFonts w:ascii="Times New Roman" w:hAnsi="Times New Roman" w:cs="Times New Roman"/>
@@ -950,6 +1123,7 @@
           <w:rFonts w:ascii="Times New Roman" w:hAnsi="Times New Roman" w:cs="Times New Roman"/>
           <w:noProof/>
         </w:rPr>
+        <w:lastRenderedPageBreak/>
         <w:drawing>
           <wp:inline distT="0" distB="0" distL="0" distR="0" wp14:anchorId="3FBC9852" wp14:editId="6FFBB9DD">
             <wp:extent cx="1619250" cy="2514390"/>
@@ -1020,15 +1194,9 @@
           <w:i/>
           <w:iCs/>
         </w:rPr>
-        <w:t>Tree sort</w:t>
-      </w:r>
-    </w:p>
-    <w:p>
-      <w:pPr>
-        <w:rPr>
-          <w:rFonts w:ascii="Times New Roman" w:hAnsi="Times New Roman" w:cs="Times New Roman"/>
-        </w:rPr>
-      </w:pPr>
+        <w:t xml:space="preserve">Tree </w:t>
+      </w:r>
+      <w:proofErr w:type="gramStart"/>
       <w:r>
         <w:rPr>
           <w:rFonts w:ascii="Times New Roman" w:hAnsi="Times New Roman" w:cs="Times New Roman"/>
@@ -1037,17 +1205,17 @@
           <w:i/>
           <w:iCs/>
         </w:rPr>
-        <w:tab/>
-      </w:r>
-      <w:r>
-        <w:rPr>
-          <w:rFonts w:ascii="Times New Roman" w:hAnsi="Times New Roman" w:cs="Times New Roman"/>
-        </w:rPr>
-        <w:t xml:space="preserve">Sort them into a binary search tree. Then just do in sort traversal to get the order. </w:t>
-      </w:r>
-    </w:p>
-    <w:p>
-      <w:pPr>
+        <w:t>sort</w:t>
+      </w:r>
+      <w:proofErr w:type="gramEnd"/>
+    </w:p>
+    <w:p>
+      <w:pPr>
+        <w:rPr>
+          <w:rFonts w:ascii="Times New Roman" w:hAnsi="Times New Roman" w:cs="Times New Roman"/>
+        </w:rPr>
+      </w:pPr>
+      <w:r>
         <w:rPr>
           <w:rFonts w:ascii="Times New Roman" w:hAnsi="Times New Roman" w:cs="Times New Roman"/>
           <w:b/>
@@ -1055,13 +1223,173 @@
           <w:i/>
           <w:iCs/>
         </w:rPr>
+        <w:tab/>
+      </w:r>
+      <w:r>
+        <w:rPr>
+          <w:rFonts w:ascii="Times New Roman" w:hAnsi="Times New Roman" w:cs="Times New Roman"/>
+        </w:rPr>
+        <w:t xml:space="preserve">Tree sort is a sort algorithm that organizes the array into a binary search tree and then traverses the tree in order so that the elements become sorted (Wikipedia, 2025a). </w:t>
+      </w:r>
+      <w:r>
+        <w:rPr>
+          <w:rFonts w:ascii="Times New Roman" w:hAnsi="Times New Roman" w:cs="Times New Roman"/>
+        </w:rPr>
+        <w:t xml:space="preserve">The average performance is </w:t>
+      </w:r>
+      <w:proofErr w:type="gramStart"/>
+      <w:r>
+        <w:rPr>
+          <w:rFonts w:ascii="Times New Roman" w:hAnsi="Times New Roman" w:cs="Times New Roman"/>
+        </w:rPr>
+        <w:t>O</w:t>
+      </w:r>
+      <w:r>
+        <w:rPr>
+          <w:rFonts w:ascii="Times New Roman" w:hAnsi="Times New Roman" w:cs="Times New Roman"/>
+        </w:rPr>
+        <w:t>(</w:t>
+      </w:r>
+      <w:proofErr w:type="gramEnd"/>
+      <w:r>
+        <w:rPr>
+          <w:rFonts w:ascii="Times New Roman" w:hAnsi="Times New Roman" w:cs="Times New Roman"/>
+          <w:i/>
+          <w:iCs/>
+        </w:rPr>
+        <w:t>n</w:t>
+      </w:r>
+      <w:r>
+        <w:rPr>
+          <w:rFonts w:ascii="Times New Roman" w:hAnsi="Times New Roman" w:cs="Times New Roman"/>
+        </w:rPr>
+        <w:t xml:space="preserve"> </w:t>
+      </w:r>
+      <w:r>
+        <w:rPr>
+          <w:rFonts w:ascii="Times New Roman" w:hAnsi="Times New Roman" w:cs="Times New Roman"/>
+          <w:i/>
+          <w:iCs/>
+        </w:rPr>
+        <w:t>log</w:t>
+      </w:r>
+      <w:r>
+        <w:rPr>
+          <w:rFonts w:ascii="Times New Roman" w:hAnsi="Times New Roman" w:cs="Times New Roman"/>
+        </w:rPr>
+        <w:t xml:space="preserve"> </w:t>
+      </w:r>
+      <w:r>
+        <w:rPr>
+          <w:rFonts w:ascii="Times New Roman" w:hAnsi="Times New Roman" w:cs="Times New Roman"/>
+          <w:i/>
+          <w:iCs/>
+        </w:rPr>
+        <w:t>n</w:t>
+      </w:r>
+      <w:r>
+        <w:rPr>
+          <w:rFonts w:ascii="Times New Roman" w:hAnsi="Times New Roman" w:cs="Times New Roman"/>
+        </w:rPr>
+        <w:t>).</w:t>
+      </w:r>
+      <w:r>
+        <w:rPr>
+          <w:rFonts w:ascii="Times New Roman" w:hAnsi="Times New Roman" w:cs="Times New Roman"/>
+        </w:rPr>
+        <w:t xml:space="preserve"> However, this can go to O(</w:t>
+      </w:r>
+      <w:r>
+        <w:rPr>
+          <w:rFonts w:ascii="Times New Roman" w:hAnsi="Times New Roman" w:cs="Times New Roman"/>
+          <w:i/>
+          <w:iCs/>
+        </w:rPr>
+        <w:t>n</w:t>
+      </w:r>
+      <w:r>
+        <w:rPr>
+          <w:rFonts w:ascii="Times New Roman" w:hAnsi="Times New Roman" w:cs="Times New Roman"/>
+          <w:i/>
+          <w:iCs/>
+          <w:vertAlign w:val="superscript"/>
+        </w:rPr>
+        <w:t>2</w:t>
+      </w:r>
+      <w:r>
+        <w:rPr>
+          <w:rFonts w:ascii="Times New Roman" w:hAnsi="Times New Roman" w:cs="Times New Roman"/>
+        </w:rPr>
+        <w:t>) if our binary search tree is unbalanced (Wikipedia, 2025a). In the visualization (</w:t>
+      </w:r>
+      <w:r>
+        <w:rPr>
+          <w:rFonts w:ascii="Times New Roman" w:hAnsi="Times New Roman" w:cs="Times New Roman"/>
+          <w:i/>
+          <w:iCs/>
+        </w:rPr>
+        <w:t>Fig. 4</w:t>
+      </w:r>
+      <w:r>
+        <w:rPr>
+          <w:rFonts w:ascii="Times New Roman" w:hAnsi="Times New Roman" w:cs="Times New Roman"/>
+        </w:rPr>
+        <w:t xml:space="preserve">) </w:t>
+      </w:r>
+      <w:r>
+        <w:rPr>
+          <w:rFonts w:ascii="Times New Roman" w:hAnsi="Times New Roman" w:cs="Times New Roman"/>
+        </w:rPr>
+        <w:t xml:space="preserve">we have the same array we have been using for previous examples sorted into the binary search tree. It follows the invariant that the left children are smaller than or equal to the parent, and the right children are greater than the parent. The figure shows an unbalanced binary search tree. To look at the sorted array, we do an </w:t>
+      </w:r>
+      <w:proofErr w:type="gramStart"/>
+      <w:r>
+        <w:rPr>
+          <w:rFonts w:ascii="Times New Roman" w:hAnsi="Times New Roman" w:cs="Times New Roman"/>
+        </w:rPr>
+        <w:t>in order</w:t>
+      </w:r>
+      <w:proofErr w:type="gramEnd"/>
+      <w:r>
+        <w:rPr>
+          <w:rFonts w:ascii="Times New Roman" w:hAnsi="Times New Roman" w:cs="Times New Roman"/>
+        </w:rPr>
+        <w:t xml:space="preserve"> traversal, that is going from the left subtree, then the parent and then the right subtree. </w:t>
+      </w:r>
+      <w:r>
+        <w:rPr>
+          <w:rFonts w:ascii="Times New Roman" w:hAnsi="Times New Roman" w:cs="Times New Roman"/>
+        </w:rPr>
+        <w:t xml:space="preserve"> </w:t>
+      </w:r>
+      <w:r>
+        <w:rPr>
+          <w:rFonts w:ascii="Times New Roman" w:hAnsi="Times New Roman" w:cs="Times New Roman"/>
+        </w:rPr>
+        <w:t xml:space="preserve"> </w:t>
+      </w:r>
+      <w:r>
+        <w:rPr>
+          <w:rFonts w:ascii="Times New Roman" w:hAnsi="Times New Roman" w:cs="Times New Roman"/>
+        </w:rPr>
+        <w:t xml:space="preserve"> </w:t>
+      </w:r>
+    </w:p>
+    <w:p>
+      <w:pPr>
+        <w:rPr>
+          <w:rFonts w:ascii="Times New Roman" w:hAnsi="Times New Roman" w:cs="Times New Roman"/>
+          <w:b/>
+          <w:bCs/>
+          <w:i/>
+          <w:iCs/>
+        </w:rPr>
       </w:pPr>
       <w:r>
         <w:rPr>
           <w:rFonts w:ascii="Times New Roman" w:hAnsi="Times New Roman" w:cs="Times New Roman"/>
           <w:noProof/>
         </w:rPr>
-        <w:lastRenderedPageBreak/>
         <w:drawing>
           <wp:inline distT="0" distB="0" distL="0" distR="0" wp14:anchorId="2E34795B" wp14:editId="2E206888">
             <wp:extent cx="2247435" cy="1809115"/>
@@ -1170,7 +1498,42 @@
         <w:rPr>
           <w:rFonts w:ascii="Times New Roman" w:hAnsi="Times New Roman" w:cs="Times New Roman"/>
         </w:rPr>
-        <w:t xml:space="preserve">The purpose of this experiment is to compare the efficiency of five common sorting algorithms (heapsort, quicksort, merge sort, tree sort, insertion sort) by tracking the number of comparisons between elements that they make when sorting arrays of integers. Inspired by the assignment we had in H6, I decided to do a similar task of generating arrays of 20,000 random integers and sorting them with the different sorting algorithms that we have. However, in order to try to take into account the possible cases in which some algorithms might do better than others depending on how the integers are arranged in the arrays, I decided to do the average element comparisons </w:t>
+        <w:t xml:space="preserve">The purpose of this experiment is to compare the efficiency of five common sorting algorithms (heapsort, quicksort, merge sort, tree sort, insertion sort) by tracking the number of comparisons between elements that they make when sorting arrays of integers. Inspired by the assignment we had in H6, I decided to do a similar task of generating arrays of 20,000 random integers and sorting them with the different sorting algorithms that we have. However, </w:t>
+      </w:r>
+      <w:proofErr w:type="gramStart"/>
+      <w:r>
+        <w:rPr>
+          <w:rFonts w:ascii="Times New Roman" w:hAnsi="Times New Roman" w:cs="Times New Roman"/>
+        </w:rPr>
+        <w:t>in order to</w:t>
+      </w:r>
+      <w:proofErr w:type="gramEnd"/>
+      <w:r>
+        <w:rPr>
+          <w:rFonts w:ascii="Times New Roman" w:hAnsi="Times New Roman" w:cs="Times New Roman"/>
+        </w:rPr>
+        <w:t xml:space="preserve"> </w:t>
+      </w:r>
+      <w:r>
+        <w:rPr>
+          <w:rFonts w:ascii="Times New Roman" w:hAnsi="Times New Roman" w:cs="Times New Roman"/>
+        </w:rPr>
+        <w:lastRenderedPageBreak/>
+        <w:t xml:space="preserve">try to </w:t>
+      </w:r>
+      <w:proofErr w:type="gramStart"/>
+      <w:r>
+        <w:rPr>
+          <w:rFonts w:ascii="Times New Roman" w:hAnsi="Times New Roman" w:cs="Times New Roman"/>
+        </w:rPr>
+        <w:t>take into account</w:t>
+      </w:r>
+      <w:proofErr w:type="gramEnd"/>
+      <w:r>
+        <w:rPr>
+          <w:rFonts w:ascii="Times New Roman" w:hAnsi="Times New Roman" w:cs="Times New Roman"/>
+        </w:rPr>
+        <w:t xml:space="preserve"> the possible cases in which some algorithms might do better than others depending on how the integers are arranged in the arrays, I decided to do the average element comparisons </w:t>
       </w:r>
       <w:r>
         <w:rPr>

</xml_diff>